<commit_message>
Add final report (docx + PDF) with pipeline screenshots
</commit_message>
<xml_diff>
--- a/report/SPE_MiniProject_Report.docx
+++ b/report/SPE_MiniProject_Report.docx
@@ -41,20 +41,12 @@
       <w:r>
         <w:rPr>
           <w:rFonts w:ascii="Calibri" w:cs="Calibri" w:eastAsia="Calibri" w:hAnsi="Calibri"/>
-          <w:sz w:val="21"/>
-          <w:szCs w:val="21"/>
-        </w:rPr>
-        <w:t xml:space="preserve">Name: </w:t>
-      </w:r>
-      <w:r>
-        <w:rPr>
-          <w:rFonts w:ascii="Calibri" w:cs="Calibri" w:eastAsia="Calibri" w:hAnsi="Calibri"/>
           <w:b/>
           <w:bCs/>
           <w:sz w:val="21"/>
           <w:szCs w:val="21"/>
         </w:rPr>
-        <w:t xml:space="preserve">&lt;YOUR NAME&gt;</w:t>
+        <w:t xml:space="preserve">Nirbhay Sharma</w:t>
       </w:r>
       <w:r>
         <w:rPr>
@@ -72,7 +64,7 @@
           <w:sz w:val="21"/>
           <w:szCs w:val="21"/>
         </w:rPr>
-        <w:t xml:space="preserve">&lt;ROLL NO&gt;</w:t>
+        <w:t xml:space="preserve">IMT2023103</w:t>
       </w:r>
       <w:r>
         <w:rPr>
@@ -96,7 +88,7 @@
         </w:rPr>
         <w:t xml:space="preserve">GitHub: </w:t>
       </w:r>
-      <w:hyperlink w:history="1" r:id="rIdpuuanrv-ko1r4yhjo_jxg">
+      <w:hyperlink w:history="1" r:id="rIdvwk3wzttqpbeho64ptnsu">
         <w:r>
           <w:rPr>
             <w:rStyle w:val="Hyperlink"/>
@@ -104,7 +96,7 @@
             <w:sz w:val="21"/>
             <w:szCs w:val="21"/>
           </w:rPr>
-          <w:t xml:space="preserve">https://github.com/NirbhaySharma504/calculator-devops</w:t>
+          <w:t xml:space="preserve">https://github.com/NirbhaySharma504/calculator_devops</w:t>
         </w:r>
       </w:hyperlink>
     </w:p>
@@ -124,7 +116,7 @@
         </w:rPr>
         <w:t xml:space="preserve">Docker Hub: </w:t>
       </w:r>
-      <w:hyperlink w:history="1" r:id="rIdbal7tnds_b1eyinxpssw6">
+      <w:hyperlink w:history="1" r:id="rId4-8neh24oukzztchsusk1">
         <w:r>
           <w:rPr>
             <w:rStyle w:val="Hyperlink"/>
@@ -132,14 +124,13 @@
             <w:sz w:val="21"/>
             <w:szCs w:val="21"/>
           </w:rPr>
-          <w:t xml:space="preserve">https://hub.docker.com/r/nirbhaysharma504/calculator-api</w:t>
+          <w:t xml:space="preserve">https://hub.docker.com/r/hades504/calculator-api</w:t>
         </w:r>
       </w:hyperlink>
     </w:p>
     <w:p>
       <w:pPr>
         <w:pStyle w:val="Heading1"/>
-        <w:spacing w:after="80" w:before="160"/>
       </w:pPr>
       <w:r>
         <w:rPr>
@@ -158,7 +149,7 @@
           <w:sz w:val="21"/>
           <w:szCs w:val="21"/>
         </w:rPr>
-        <w:t xml:space="preserve">The goal was to build a small, production-style Calculator REST API and wrap it in a fully automated DevOps pipeline. A single git push to GitHub builds, tests, containerises, publishes and redeploys the service with no manual steps. The application is deliberately simple; the work is in the pipeline around it.</w:t>
+        <w:t xml:space="preserve">The goal was to build a small, production-style Calculator REST API and wrap it in a fully automated DevOps pipeline: merging a change on GitHub builds, tests, containerises, publishes and redeploys the service with no manual steps. The application is deliberately simple; the work is in the pipeline around it.</w:t>
       </w:r>
     </w:p>
     <w:tbl>
@@ -414,7 +405,7 @@
                 <w:sz w:val="19"/>
                 <w:szCs w:val="19"/>
               </w:rPr>
-              <w:t xml:space="preserve">Git + GitHub: feature branches merged through pull requests</w:t>
+              <w:t xml:space="preserve">Git + GitHub: 7 feature branches, each merged through a pull request</w:t>
             </w:r>
           </w:p>
         </w:tc>
@@ -473,7 +464,7 @@
                 <w:sz w:val="19"/>
                 <w:szCs w:val="19"/>
               </w:rPr>
-              <w:t xml:space="preserve">Jenkins LTS (declarative Jenkinsfile), GitHub webhook via ngrok, Poll SCM fallback, Email Extension</w:t>
+              <w:t xml:space="preserve">Jenkins LTS (declarative Jenkinsfile), GitHub webhook through an ngrok tunnel, Poll SCM fallback, Email Extension</w:t>
             </w:r>
           </w:p>
         </w:tc>
@@ -532,7 +523,7 @@
                 <w:sz w:val="19"/>
                 <w:szCs w:val="19"/>
               </w:rPr>
-              <w:t xml:space="preserve">Docker multi-stage build; image published on Docker Hub</w:t>
+              <w:t xml:space="preserve">Docker multi-stage build; image published as hades504/calculator-api on Docker Hub</w:t>
             </w:r>
           </w:p>
         </w:tc>
@@ -600,7 +591,6 @@
     <w:p>
       <w:pPr>
         <w:pStyle w:val="Heading1"/>
-        <w:spacing w:after="80" w:before="160"/>
       </w:pPr>
       <w:r>
         <w:rPr>
@@ -619,7 +609,7 @@
           <wp:inline distT="0" distB="0" distL="0" distR="0">
             <wp:extent cx="6286500" cy="2962275"/>
             <wp:effectExtent t="0" r="0" b="0" l="0"/>
-            <wp:docPr id="1" name="architecture" descr="Developer to GitHub to Jenkins stages to Docker Hub and Docker Compose" title="Pipeline architecture"/>
+            <wp:docPr id="1" name="architecture.png" descr="architecture.png" title="architecture.png"/>
             <wp:cNvGraphicFramePr>
               <a:graphicFrameLocks xmlns:a="http://schemas.openxmlformats.org/drawingml/2006/main" noChangeAspect="1"/>
             </wp:cNvGraphicFramePr>
@@ -657,7 +647,7 @@
     </w:p>
     <w:p>
       <w:pPr>
-        <w:spacing w:after="100"/>
+        <w:spacing w:after="200" w:before="40"/>
         <w:jc w:val="center"/>
       </w:pPr>
       <w:r>
@@ -668,13 +658,12 @@
           <w:sz w:val="19"/>
           <w:szCs w:val="19"/>
         </w:rPr>
-        <w:t xml:space="preserve">Figure 1: CI/CD pipeline. A push triggers Jenkins through a GitHub webhook; Jenkins builds, tests, publishes and deploys the stack.</w:t>
+        <w:t xml:space="preserve">Figure 1: CI/CD pipeline. A merge to main reaches Jenkins through a GitHub webhook; Jenkins builds, tests, publishes and deploys the stack.</w:t>
       </w:r>
     </w:p>
     <w:p>
       <w:pPr>
         <w:pStyle w:val="Heading1"/>
-        <w:spacing w:after="80" w:before="160"/>
       </w:pPr>
       <w:r>
         <w:rPr>
@@ -741,20 +730,7 @@
           <w:sz w:val="21"/>
           <w:szCs w:val="21"/>
         </w:rPr>
-        <w:t xml:space="preserve">, which the Docker, Compose and Jenkins health checks all use.</w:t>
-      </w:r>
-    </w:p>
-    <w:p>
-      <w:pPr>
-        <w:spacing w:after="80" w:line="264"/>
-      </w:pPr>
-      <w:r>
-        <w:rPr>
-          <w:rFonts w:ascii="Calibri" w:cs="Calibri" w:eastAsia="Calibri" w:hAnsi="Calibri"/>
-          <w:sz w:val="21"/>
-          <w:szCs w:val="21"/>
-        </w:rPr>
-        <w:t xml:space="preserve">Validation lives in </w:t>
+        <w:t xml:space="preserve"> (used by the Docker, Compose and Jenkins health checks) and </w:t>
       </w:r>
       <w:r>
         <w:rPr>
@@ -762,15 +738,28 @@
           <w:sz w:val="19"/>
           <w:szCs w:val="19"/>
         </w:rPr>
-        <w:t xml:space="preserve">CalculatorService</w:t>
-      </w:r>
-      <w:r>
-        <w:rPr>
-          <w:rFonts w:ascii="Calibri" w:cs="Calibri" w:eastAsia="Calibri" w:hAnsi="Calibri"/>
-          <w:sz w:val="21"/>
-          <w:szCs w:val="21"/>
-        </w:rPr>
-        <w:t xml:space="preserve">. A </w:t>
+        <w:t xml:space="preserve">/actuator/info</w:t>
+      </w:r>
+      <w:r>
+        <w:rPr>
+          <w:rFonts w:ascii="Calibri" w:cs="Calibri" w:eastAsia="Calibri" w:hAnsi="Calibri"/>
+          <w:sz w:val="21"/>
+          <w:szCs w:val="21"/>
+        </w:rPr>
+        <w:t xml:space="preserve"> (shows the deployed version).</w:t>
+      </w:r>
+    </w:p>
+    <w:p>
+      <w:pPr>
+        <w:spacing w:after="80" w:line="264"/>
+      </w:pPr>
+      <w:r>
+        <w:rPr>
+          <w:rFonts w:ascii="Calibri" w:cs="Calibri" w:eastAsia="Calibri" w:hAnsi="Calibri"/>
+          <w:sz w:val="21"/>
+          <w:szCs w:val="21"/>
+        </w:rPr>
+        <w:t xml:space="preserve">Validation lives in </w:t>
       </w:r>
       <w:r>
         <w:rPr>
@@ -778,33 +767,15 @@
           <w:sz w:val="19"/>
           <w:szCs w:val="19"/>
         </w:rPr>
-        <w:t xml:space="preserve">@RestControllerAdvice</w:t>
-      </w:r>
-      <w:r>
-        <w:rPr>
-          <w:rFonts w:ascii="Calibri" w:cs="Calibri" w:eastAsia="Calibri" w:hAnsi="Calibri"/>
-          <w:sz w:val="21"/>
-          <w:szCs w:val="21"/>
-        </w:rPr>
-        <w:t xml:space="preserve"> maps every invalid request to </w:t>
-      </w:r>
-      <w:r>
-        <w:rPr>
-          <w:rFonts w:ascii="Calibri" w:cs="Calibri" w:eastAsia="Calibri" w:hAnsi="Calibri"/>
-          <w:b/>
-          <w:bCs/>
-          <w:sz w:val="21"/>
-          <w:szCs w:val="21"/>
-        </w:rPr>
-        <w:t xml:space="preserve">HTTP 400</w:t>
-      </w:r>
-      <w:r>
-        <w:rPr>
-          <w:rFonts w:ascii="Calibri" w:cs="Calibri" w:eastAsia="Calibri" w:hAnsi="Calibri"/>
-          <w:sz w:val="21"/>
-          <w:szCs w:val="21"/>
-        </w:rPr>
-        <w:t xml:space="preserve"> with a structured body </w:t>
+        <w:t xml:space="preserve">CalculatorService</w:t>
+      </w:r>
+      <w:r>
+        <w:rPr>
+          <w:rFonts w:ascii="Calibri" w:cs="Calibri" w:eastAsia="Calibri" w:hAnsi="Calibri"/>
+          <w:sz w:val="21"/>
+          <w:szCs w:val="21"/>
+        </w:rPr>
+        <w:t xml:space="preserve">. A </w:t>
       </w:r>
       <w:r>
         <w:rPr>
@@ -812,53 +783,33 @@
           <w:sz w:val="19"/>
           <w:szCs w:val="19"/>
         </w:rPr>
-        <w:t xml:space="preserve">{timestamp, status, error, message, path}</w:t>
-      </w:r>
-      <w:r>
-        <w:rPr>
-          <w:rFonts w:ascii="Calibri" w:cs="Calibri" w:eastAsia="Calibri" w:hAnsi="Calibri"/>
-          <w:sz w:val="21"/>
-          <w:szCs w:val="21"/>
-        </w:rPr>
-        <w:t xml:space="preserve">. That covers division or modulo by zero, square root of a negative number, missing or non-numeric parameters, NaN/Infinity inputs and overflowing results.</w:t>
-      </w:r>
-    </w:p>
-    <w:p>
-      <w:pPr>
-        <w:spacing w:after="80" w:line="264"/>
-      </w:pPr>
-      <w:r>
-        <w:rPr>
-          <w:rFonts w:ascii="Calibri" w:cs="Calibri" w:eastAsia="Calibri" w:hAnsi="Calibri"/>
-          <w:sz w:val="21"/>
-          <w:szCs w:val="21"/>
-        </w:rPr>
-        <w:t xml:space="preserve">Unit tests (JUnit 5, parameterised) cover every operation and each edge case. Integration tests start the full Spring context and send real requests through MockMvc, checking successful responses, error bodies and the health endpoint. Maven Surefire writes JUnit XML, which Jenkins publishes on every build.</w:t>
-      </w:r>
-    </w:p>
-    <w:p>
-      <w:pPr>
-        <w:pStyle w:val="Heading1"/>
-        <w:spacing w:after="80" w:before="160"/>
-      </w:pPr>
-      <w:r>
-        <w:rPr>
-          <w:rFonts w:ascii="Calibri" w:cs="Calibri" w:eastAsia="Calibri" w:hAnsi="Calibri"/>
-        </w:rPr>
-        <w:t xml:space="preserve">4. Jenkins Pipeline — Stage by Stage</w:t>
-      </w:r>
-    </w:p>
-    <w:p>
-      <w:pPr>
-        <w:spacing w:after="80" w:line="264"/>
-      </w:pPr>
-      <w:r>
-        <w:rPr>
-          <w:rFonts w:ascii="Calibri" w:cs="Calibri" w:eastAsia="Calibri" w:hAnsi="Calibri"/>
-          <w:sz w:val="21"/>
-          <w:szCs w:val="21"/>
-        </w:rPr>
-        <w:t xml:space="preserve">The pipeline is a declarative </w:t>
+        <w:t xml:space="preserve">@RestControllerAdvice</w:t>
+      </w:r>
+      <w:r>
+        <w:rPr>
+          <w:rFonts w:ascii="Calibri" w:cs="Calibri" w:eastAsia="Calibri" w:hAnsi="Calibri"/>
+          <w:sz w:val="21"/>
+          <w:szCs w:val="21"/>
+        </w:rPr>
+        <w:t xml:space="preserve"> maps every invalid request to </w:t>
+      </w:r>
+      <w:r>
+        <w:rPr>
+          <w:rFonts w:ascii="Calibri" w:cs="Calibri" w:eastAsia="Calibri" w:hAnsi="Calibri"/>
+          <w:b/>
+          <w:bCs/>
+          <w:sz w:val="21"/>
+          <w:szCs w:val="21"/>
+        </w:rPr>
+        <w:t xml:space="preserve">HTTP 400</w:t>
+      </w:r>
+      <w:r>
+        <w:rPr>
+          <w:rFonts w:ascii="Calibri" w:cs="Calibri" w:eastAsia="Calibri" w:hAnsi="Calibri"/>
+          <w:sz w:val="21"/>
+          <w:szCs w:val="21"/>
+        </w:rPr>
+        <w:t xml:space="preserve"> with a structured body </w:t>
       </w:r>
       <w:r>
         <w:rPr>
@@ -866,15 +817,52 @@
           <w:sz w:val="19"/>
           <w:szCs w:val="19"/>
         </w:rPr>
-        <w:t xml:space="preserve">Jenkinsfile</w:t>
-      </w:r>
-      <w:r>
-        <w:rPr>
-          <w:rFonts w:ascii="Calibri" w:cs="Calibri" w:eastAsia="Calibri" w:hAnsi="Calibri"/>
-          <w:sz w:val="21"/>
-          <w:szCs w:val="21"/>
-        </w:rPr>
-        <w:t xml:space="preserve"> in the repository. </w:t>
+        <w:t xml:space="preserve">{timestamp, status, error, message, path}</w:t>
+      </w:r>
+      <w:r>
+        <w:rPr>
+          <w:rFonts w:ascii="Calibri" w:cs="Calibri" w:eastAsia="Calibri" w:hAnsi="Calibri"/>
+          <w:sz w:val="21"/>
+          <w:szCs w:val="21"/>
+        </w:rPr>
+        <w:t xml:space="preserve">. That covers division or modulo by zero, square root of a negative number, missing or non-numeric parameters, NaN/Infinity inputs and results that overflow.</w:t>
+      </w:r>
+    </w:p>
+    <w:p>
+      <w:pPr>
+        <w:spacing w:after="80" w:line="264"/>
+      </w:pPr>
+      <w:r>
+        <w:rPr>
+          <w:rFonts w:ascii="Calibri" w:cs="Calibri" w:eastAsia="Calibri" w:hAnsi="Calibri"/>
+          <w:sz w:val="21"/>
+          <w:szCs w:val="21"/>
+        </w:rPr>
+        <w:t xml:space="preserve">Parameterised JUnit 5 unit tests cover every operation and edge case. Integration tests start the full Spring context and send real requests through MockMvc, checking successful responses, error bodies and the health endpoint. Maven Surefire writes JUnit XML, which Jenkins publishes on every build (57 tests, 0 failures; Figure A3).</w:t>
+      </w:r>
+    </w:p>
+    <w:p>
+      <w:pPr>
+        <w:pStyle w:val="Heading1"/>
+      </w:pPr>
+      <w:r>
+        <w:rPr>
+          <w:rFonts w:ascii="Calibri" w:cs="Calibri" w:eastAsia="Calibri" w:hAnsi="Calibri"/>
+        </w:rPr>
+        <w:t xml:space="preserve">4. Jenkins Pipeline — Stage by Stage</w:t>
+      </w:r>
+    </w:p>
+    <w:p>
+      <w:pPr>
+        <w:spacing w:after="80" w:line="264"/>
+      </w:pPr>
+      <w:r>
+        <w:rPr>
+          <w:rFonts w:ascii="Calibri" w:cs="Calibri" w:eastAsia="Calibri" w:hAnsi="Calibri"/>
+          <w:sz w:val="21"/>
+          <w:szCs w:val="21"/>
+        </w:rPr>
+        <w:t xml:space="preserve">The pipeline is a declarative </w:t>
       </w:r>
       <w:r>
         <w:rPr>
@@ -882,15 +870,15 @@
           <w:sz w:val="19"/>
           <w:szCs w:val="19"/>
         </w:rPr>
-        <w:t xml:space="preserve">githubPush()</w:t>
-      </w:r>
-      <w:r>
-        <w:rPr>
-          <w:rFonts w:ascii="Calibri" w:cs="Calibri" w:eastAsia="Calibri" w:hAnsi="Calibri"/>
-          <w:sz w:val="21"/>
-          <w:szCs w:val="21"/>
-        </w:rPr>
-        <w:t xml:space="preserve"> starts it from the GitHub webhook, and </w:t>
+        <w:t xml:space="preserve">Jenkinsfile</w:t>
+      </w:r>
+      <w:r>
+        <w:rPr>
+          <w:rFonts w:ascii="Calibri" w:cs="Calibri" w:eastAsia="Calibri" w:hAnsi="Calibri"/>
+          <w:sz w:val="21"/>
+          <w:szCs w:val="21"/>
+        </w:rPr>
+        <w:t xml:space="preserve"> in the repository. </w:t>
       </w:r>
       <w:r>
         <w:rPr>
@@ -898,15 +886,15 @@
           <w:sz w:val="19"/>
           <w:szCs w:val="19"/>
         </w:rPr>
-        <w:t xml:space="preserve">pollSCM('H/5 * * * *')</w:t>
-      </w:r>
-      <w:r>
-        <w:rPr>
-          <w:rFonts w:ascii="Calibri" w:cs="Calibri" w:eastAsia="Calibri" w:hAnsi="Calibri"/>
-          <w:sz w:val="21"/>
-          <w:szCs w:val="21"/>
-        </w:rPr>
-        <w:t xml:space="preserve"> is a fallback. </w:t>
+        <w:t xml:space="preserve">githubPush()</w:t>
+      </w:r>
+      <w:r>
+        <w:rPr>
+          <w:rFonts w:ascii="Calibri" w:cs="Calibri" w:eastAsia="Calibri" w:hAnsi="Calibri"/>
+          <w:sz w:val="21"/>
+          <w:szCs w:val="21"/>
+        </w:rPr>
+        <w:t xml:space="preserve"> starts it from the GitHub webhook, and </w:t>
       </w:r>
       <w:r>
         <w:rPr>
@@ -914,6 +902,22 @@
           <w:sz w:val="19"/>
           <w:szCs w:val="19"/>
         </w:rPr>
+        <w:t xml:space="preserve">pollSCM('H/5 * * * *')</w:t>
+      </w:r>
+      <w:r>
+        <w:rPr>
+          <w:rFonts w:ascii="Calibri" w:cs="Calibri" w:eastAsia="Calibri" w:hAnsi="Calibri"/>
+          <w:sz w:val="21"/>
+          <w:szCs w:val="21"/>
+        </w:rPr>
+        <w:t xml:space="preserve"> is a fallback. </w:t>
+      </w:r>
+      <w:r>
+        <w:rPr>
+          <w:rFonts w:ascii="Consolas" w:cs="Consolas" w:eastAsia="Consolas" w:hAnsi="Consolas"/>
+          <w:sz w:val="19"/>
+          <w:szCs w:val="19"/>
+        </w:rPr>
         <w:t xml:space="preserve">disableConcurrentBuilds()</w:t>
       </w:r>
       <w:r>
@@ -922,7 +926,7 @@
           <w:sz w:val="21"/>
           <w:szCs w:val="21"/>
         </w:rPr>
-        <w:t xml:space="preserve"> stops two pushes from deploying at once.</w:t>
+        <w:t xml:space="preserve"> stops two merges from deploying at once.</w:t>
       </w:r>
     </w:p>
     <w:p>
@@ -1090,7 +1094,7 @@
           <w:sz w:val="21"/>
           <w:szCs w:val="21"/>
         </w:rPr>
-        <w:t xml:space="preserve">IMAGE_TAG=&lt;build&gt; docker compose up -d --remove-orphans, then a loop polls /actuator/health through Nginx for up to 60 s. Smoke tests follow: add must return 5.0 and divide-by-zero must return 400. On failure the stage prints the container status and logs.</w:t>
+        <w:t xml:space="preserve">IMAGE_TAG=&lt;build&gt; docker compose up -d --remove-orphans, then a loop polls /actuator/health through Nginx for up to 60 s. Smoke tests follow: add must return 5.0 and divide-by-zero must return 400 (Figure A4). On failure the stage prints the container status and logs.</w:t>
       </w:r>
     </w:p>
     <w:p>
@@ -1118,7 +1122,7 @@
           <w:sz w:val="21"/>
           <w:szCs w:val="21"/>
         </w:rPr>
-        <w:t xml:space="preserve">emailext sends a SUCCESS or FAILURE email (the failure email attaches the log), then old local images are pruned.</w:t>
+        <w:t xml:space="preserve">emailext sends a SUCCESS or FAILURE email (the failure email attaches the log), then dangling images and old build tags are pruned locally.</w:t>
       </w:r>
     </w:p>
     <w:p>
@@ -1141,13 +1145,12 @@
           <w:sz w:val="21"/>
           <w:szCs w:val="21"/>
         </w:rPr>
-        <w:t xml:space="preserve">compose up -d reconciles the running stack to the desired state and only recreates containers whose image or configuration changed. The pipeline never runs down, so re-running a build leaves a healthy deployment in place.</w:t>
+        <w:t xml:space="preserve">compose up -d reconciles the running stack to the desired state and only recreates containers whose image or configuration changed. The pipeline never runs down. Re-running build #5 by hand replaced only the app container; Nginx kept running and kept serving traffic.</w:t>
       </w:r>
     </w:p>
     <w:p>
       <w:pPr>
         <w:pStyle w:val="Heading1"/>
-        <w:spacing w:after="80" w:before="160"/>
       </w:pPr>
       <w:r>
         <w:rPr>
@@ -1181,7 +1184,7 @@
           <w:sz w:val="21"/>
           <w:szCs w:val="21"/>
         </w:rPr>
-        <w:t xml:space="preserve">a maven:3.9-eclipse-temurin-21 stage builds the JAR. The runtime stage is eclipse-temurin:21-jre-alpine and receives only the JAR, so no JDK, Maven or source code ships.</w:t>
+        <w:t xml:space="preserve">a maven:3.9-eclipse-temurin-21 stage builds the JAR. The runtime stage is eclipse-temurin:21-jre-alpine and receives only the JAR, so no JDK, Maven or source code ships (90 MB compressed on Docker Hub).</w:t>
       </w:r>
     </w:p>
     <w:p>
@@ -1271,7 +1274,6 @@
     <w:p>
       <w:pPr>
         <w:pStyle w:val="Heading1"/>
-        <w:spacing w:after="80" w:before="160"/>
       </w:pPr>
       <w:r>
         <w:rPr>
@@ -1290,35 +1292,572 @@
           <w:sz w:val="21"/>
           <w:szCs w:val="21"/>
         </w:rPr>
-        <w:t xml:space="preserve">The work was developed in small commits on feature branches (feature/calculator-api, feature/docker, feature/compose-nginx, feature/jenkins-pipeline, docs/readme-report). Each branch was merged into main through a GitHub pull request, keeping merge commits so the history stays visible. The .gitignore excludes target/, IDE files, .env and key files. No credentials are in the repository: the Docker Hub token and the SMTP password exist only in the Jenkins Credentials store, and the notification address is a Jenkins global variable.</w:t>
+        <w:t xml:space="preserve">Work was done in small commits on feature branches (feature/calculator-api, feature/docker, feature/compose-nginx, feature/jenkins-pipeline, docs/readme-report, fix/dockerhub-namespace, release/1.0.0). Each branch was merged into main through a GitHub pull request with a merge commit, so the history stays visible (Figures A6 and A7). The .gitignore excludes target/, IDE files, .env and key files. No credentials are in the repository: the Docker Hub token and the Gmail app password exist only in the Jenkins Credentials store, and the notification address is a Jenkins global variable.</w:t>
       </w:r>
     </w:p>
     <w:p>
       <w:pPr>
         <w:pStyle w:val="Heading1"/>
-        <w:spacing w:after="80" w:before="160"/>
-      </w:pPr>
-      <w:r>
-        <w:rPr>
-          <w:rFonts w:ascii="Calibri" w:cs="Calibri" w:eastAsia="Calibri" w:hAnsi="Calibri"/>
-        </w:rPr>
-        <w:t xml:space="preserve">7. Challenges Faced and Solutions</w:t>
-      </w:r>
-    </w:p>
-    <w:p>
-      <w:pPr>
-        <w:spacing w:after="80" w:line="264"/>
-      </w:pPr>
-      <w:r>
-        <w:rPr>
-          <w:rFonts w:ascii="Calibri" w:cs="Calibri" w:eastAsia="Calibri" w:hAnsi="Calibri"/>
-          <w:i/>
-          <w:iCs/>
-          <w:color w:val="B45309"/>
-          <w:sz w:val="21"/>
-          <w:szCs w:val="21"/>
-        </w:rPr>
-        <w:t xml:space="preserve">Edit this list to match what actually happened during your setup.</w:t>
+      </w:pPr>
+      <w:r>
+        <w:rPr>
+          <w:rFonts w:ascii="Calibri" w:cs="Calibri" w:eastAsia="Calibri" w:hAnsi="Calibri"/>
+        </w:rPr>
+        <w:t xml:space="preserve">7. Results</w:t>
+      </w:r>
+    </w:p>
+    <w:tbl>
+      <w:tblPr>
+        <w:tblW w:type="dxa" w:w="10206"/>
+        <w:tblBorders>
+          <w:top w:val="single" w:color="auto" w:sz="4"/>
+          <w:left w:val="single" w:color="auto" w:sz="4"/>
+          <w:bottom w:val="single" w:color="auto" w:sz="4"/>
+          <w:right w:val="single" w:color="auto" w:sz="4"/>
+          <w:insideH w:val="single" w:color="auto" w:sz="4"/>
+          <w:insideV w:val="single" w:color="auto" w:sz="4"/>
+        </w:tblBorders>
+      </w:tblPr>
+      <w:tblGrid>
+        <w:gridCol w:w="1000"/>
+        <w:gridCol w:w="2400"/>
+        <w:gridCol w:w="6806"/>
+      </w:tblGrid>
+      <w:tr>
+        <w:trPr>
+          <w:tblHeader/>
+        </w:trPr>
+        <w:tc>
+          <w:tcPr>
+            <w:tcW w:type="dxa" w:w="1000"/>
+            <w:tcBorders>
+              <w:top w:val="single" w:color="94A3B8" w:sz="4"/>
+              <w:left w:val="single" w:color="94A3B8" w:sz="4"/>
+              <w:bottom w:val="single" w:color="94A3B8" w:sz="4"/>
+              <w:right w:val="single" w:color="94A3B8" w:sz="4"/>
+            </w:tcBorders>
+            <w:shd w:fill="E2E8F0" w:color="auto" w:val="clear"/>
+            <w:tcMar>
+              <w:top w:type="dxa" w:w="40"/>
+              <w:left w:type="dxa" w:w="90"/>
+              <w:bottom w:type="dxa" w:w="40"/>
+              <w:right w:type="dxa" w:w="90"/>
+            </w:tcMar>
+          </w:tcPr>
+          <w:p>
+            <w:r>
+              <w:rPr>
+                <w:rFonts w:ascii="Calibri" w:cs="Calibri" w:eastAsia="Calibri" w:hAnsi="Calibri"/>
+                <w:b/>
+                <w:bCs/>
+                <w:sz w:val="19"/>
+                <w:szCs w:val="19"/>
+              </w:rPr>
+              <w:t xml:space="preserve">Build</w:t>
+            </w:r>
+          </w:p>
+        </w:tc>
+        <w:tc>
+          <w:tcPr>
+            <w:tcW w:type="dxa" w:w="2400"/>
+            <w:tcBorders>
+              <w:top w:val="single" w:color="94A3B8" w:sz="4"/>
+              <w:left w:val="single" w:color="94A3B8" w:sz="4"/>
+              <w:bottom w:val="single" w:color="94A3B8" w:sz="4"/>
+              <w:right w:val="single" w:color="94A3B8" w:sz="4"/>
+            </w:tcBorders>
+            <w:shd w:fill="E2E8F0" w:color="auto" w:val="clear"/>
+            <w:tcMar>
+              <w:top w:type="dxa" w:w="40"/>
+              <w:left w:type="dxa" w:w="90"/>
+              <w:bottom w:type="dxa" w:w="40"/>
+              <w:right w:type="dxa" w:w="90"/>
+            </w:tcMar>
+          </w:tcPr>
+          <w:p>
+            <w:r>
+              <w:rPr>
+                <w:rFonts w:ascii="Calibri" w:cs="Calibri" w:eastAsia="Calibri" w:hAnsi="Calibri"/>
+                <w:b/>
+                <w:bCs/>
+                <w:sz w:val="19"/>
+                <w:szCs w:val="19"/>
+              </w:rPr>
+              <w:t xml:space="preserve">Trigger</w:t>
+            </w:r>
+          </w:p>
+        </w:tc>
+        <w:tc>
+          <w:tcPr>
+            <w:tcW w:type="dxa" w:w="6806"/>
+            <w:tcBorders>
+              <w:top w:val="single" w:color="94A3B8" w:sz="4"/>
+              <w:left w:val="single" w:color="94A3B8" w:sz="4"/>
+              <w:bottom w:val="single" w:color="94A3B8" w:sz="4"/>
+              <w:right w:val="single" w:color="94A3B8" w:sz="4"/>
+            </w:tcBorders>
+            <w:shd w:fill="E2E8F0" w:color="auto" w:val="clear"/>
+            <w:tcMar>
+              <w:top w:type="dxa" w:w="40"/>
+              <w:left w:type="dxa" w:w="90"/>
+              <w:bottom w:type="dxa" w:w="40"/>
+              <w:right w:type="dxa" w:w="90"/>
+            </w:tcMar>
+          </w:tcPr>
+          <w:p>
+            <w:r>
+              <w:rPr>
+                <w:rFonts w:ascii="Calibri" w:cs="Calibri" w:eastAsia="Calibri" w:hAnsi="Calibri"/>
+                <w:b/>
+                <w:bCs/>
+                <w:sz w:val="19"/>
+                <w:szCs w:val="19"/>
+              </w:rPr>
+              <w:t xml:space="preserve">Outcome</w:t>
+            </w:r>
+          </w:p>
+        </w:tc>
+      </w:tr>
+      <w:tr>
+        <w:trPr>
+          <w:tblHeader w:val="off"/>
+        </w:trPr>
+        <w:tc>
+          <w:tcPr>
+            <w:tcW w:type="dxa" w:w="1000"/>
+            <w:tcBorders>
+              <w:top w:val="single" w:color="94A3B8" w:sz="4"/>
+              <w:left w:val="single" w:color="94A3B8" w:sz="4"/>
+              <w:bottom w:val="single" w:color="94A3B8" w:sz="4"/>
+              <w:right w:val="single" w:color="94A3B8" w:sz="4"/>
+            </w:tcBorders>
+            <w:tcMar>
+              <w:top w:type="dxa" w:w="40"/>
+              <w:left w:type="dxa" w:w="90"/>
+              <w:bottom w:type="dxa" w:w="40"/>
+              <w:right w:type="dxa" w:w="90"/>
+            </w:tcMar>
+          </w:tcPr>
+          <w:p>
+            <w:r>
+              <w:rPr>
+                <w:rFonts w:ascii="Calibri" w:cs="Calibri" w:eastAsia="Calibri" w:hAnsi="Calibri"/>
+                <w:sz w:val="19"/>
+                <w:szCs w:val="19"/>
+              </w:rPr>
+              <w:t xml:space="preserve">#1</w:t>
+            </w:r>
+          </w:p>
+        </w:tc>
+        <w:tc>
+          <w:tcPr>
+            <w:tcW w:type="dxa" w:w="2400"/>
+            <w:tcBorders>
+              <w:top w:val="single" w:color="94A3B8" w:sz="4"/>
+              <w:left w:val="single" w:color="94A3B8" w:sz="4"/>
+              <w:bottom w:val="single" w:color="94A3B8" w:sz="4"/>
+              <w:right w:val="single" w:color="94A3B8" w:sz="4"/>
+            </w:tcBorders>
+            <w:tcMar>
+              <w:top w:type="dxa" w:w="40"/>
+              <w:left w:type="dxa" w:w="90"/>
+              <w:bottom w:type="dxa" w:w="40"/>
+              <w:right w:type="dxa" w:w="90"/>
+            </w:tcMar>
+          </w:tcPr>
+          <w:p>
+            <w:r>
+              <w:rPr>
+                <w:rFonts w:ascii="Calibri" w:cs="Calibri" w:eastAsia="Calibri" w:hAnsi="Calibri"/>
+                <w:sz w:val="19"/>
+                <w:szCs w:val="19"/>
+              </w:rPr>
+              <w:t xml:space="preserve">Manual (first run)</w:t>
+            </w:r>
+          </w:p>
+        </w:tc>
+        <w:tc>
+          <w:tcPr>
+            <w:tcW w:type="dxa" w:w="6806"/>
+            <w:tcBorders>
+              <w:top w:val="single" w:color="94A3B8" w:sz="4"/>
+              <w:left w:val="single" w:color="94A3B8" w:sz="4"/>
+              <w:bottom w:val="single" w:color="94A3B8" w:sz="4"/>
+              <w:right w:val="single" w:color="94A3B8" w:sz="4"/>
+            </w:tcBorders>
+            <w:tcMar>
+              <w:top w:type="dxa" w:w="40"/>
+              <w:left w:type="dxa" w:w="90"/>
+              <w:bottom w:type="dxa" w:w="40"/>
+              <w:right w:type="dxa" w:w="90"/>
+            </w:tcMar>
+          </w:tcPr>
+          <w:p>
+            <w:r>
+              <w:rPr>
+                <w:rFonts w:ascii="Calibri" w:cs="Calibri" w:eastAsia="Calibri" w:hAnsi="Calibri"/>
+                <w:sz w:val="19"/>
+                <w:szCs w:val="19"/>
+              </w:rPr>
+              <w:t xml:space="preserve">Failed at Docker Build: Docker Desktop was not running. Failure email sent.</w:t>
+            </w:r>
+          </w:p>
+        </w:tc>
+      </w:tr>
+      <w:tr>
+        <w:trPr>
+          <w:tblHeader w:val="off"/>
+        </w:trPr>
+        <w:tc>
+          <w:tcPr>
+            <w:tcW w:type="dxa" w:w="1000"/>
+            <w:tcBorders>
+              <w:top w:val="single" w:color="94A3B8" w:sz="4"/>
+              <w:left w:val="single" w:color="94A3B8" w:sz="4"/>
+              <w:bottom w:val="single" w:color="94A3B8" w:sz="4"/>
+              <w:right w:val="single" w:color="94A3B8" w:sz="4"/>
+            </w:tcBorders>
+            <w:tcMar>
+              <w:top w:type="dxa" w:w="40"/>
+              <w:left w:type="dxa" w:w="90"/>
+              <w:bottom w:type="dxa" w:w="40"/>
+              <w:right w:type="dxa" w:w="90"/>
+            </w:tcMar>
+          </w:tcPr>
+          <w:p>
+            <w:r>
+              <w:rPr>
+                <w:rFonts w:ascii="Calibri" w:cs="Calibri" w:eastAsia="Calibri" w:hAnsi="Calibri"/>
+                <w:sz w:val="19"/>
+                <w:szCs w:val="19"/>
+              </w:rPr>
+              <w:t xml:space="preserve">#2</w:t>
+            </w:r>
+          </w:p>
+        </w:tc>
+        <w:tc>
+          <w:tcPr>
+            <w:tcW w:type="dxa" w:w="2400"/>
+            <w:tcBorders>
+              <w:top w:val="single" w:color="94A3B8" w:sz="4"/>
+              <w:left w:val="single" w:color="94A3B8" w:sz="4"/>
+              <w:bottom w:val="single" w:color="94A3B8" w:sz="4"/>
+              <w:right w:val="single" w:color="94A3B8" w:sz="4"/>
+            </w:tcBorders>
+            <w:tcMar>
+              <w:top w:type="dxa" w:w="40"/>
+              <w:left w:type="dxa" w:w="90"/>
+              <w:bottom w:type="dxa" w:w="40"/>
+              <w:right w:type="dxa" w:w="90"/>
+            </w:tcMar>
+          </w:tcPr>
+          <w:p>
+            <w:r>
+              <w:rPr>
+                <w:rFonts w:ascii="Calibri" w:cs="Calibri" w:eastAsia="Calibri" w:hAnsi="Calibri"/>
+                <w:sz w:val="19"/>
+                <w:szCs w:val="19"/>
+              </w:rPr>
+              <w:t xml:space="preserve">Manual</w:t>
+            </w:r>
+          </w:p>
+        </w:tc>
+        <w:tc>
+          <w:tcPr>
+            <w:tcW w:type="dxa" w:w="6806"/>
+            <w:tcBorders>
+              <w:top w:val="single" w:color="94A3B8" w:sz="4"/>
+              <w:left w:val="single" w:color="94A3B8" w:sz="4"/>
+              <w:bottom w:val="single" w:color="94A3B8" w:sz="4"/>
+              <w:right w:val="single" w:color="94A3B8" w:sz="4"/>
+            </w:tcBorders>
+            <w:tcMar>
+              <w:top w:type="dxa" w:w="40"/>
+              <w:left w:type="dxa" w:w="90"/>
+              <w:bottom w:type="dxa" w:w="40"/>
+              <w:right w:type="dxa" w:w="90"/>
+            </w:tcMar>
+          </w:tcPr>
+          <w:p>
+            <w:r>
+              <w:rPr>
+                <w:rFonts w:ascii="Calibri" w:cs="Calibri" w:eastAsia="Calibri" w:hAnsi="Calibri"/>
+                <w:sz w:val="19"/>
+                <w:szCs w:val="19"/>
+              </w:rPr>
+              <w:t xml:space="preserve">Failed at Push: Docker Hub rejected the login (wrong account name in the image tag). Deploy skipped; failure email sent.</w:t>
+            </w:r>
+          </w:p>
+        </w:tc>
+      </w:tr>
+      <w:tr>
+        <w:trPr>
+          <w:tblHeader w:val="off"/>
+        </w:trPr>
+        <w:tc>
+          <w:tcPr>
+            <w:tcW w:type="dxa" w:w="1000"/>
+            <w:tcBorders>
+              <w:top w:val="single" w:color="94A3B8" w:sz="4"/>
+              <w:left w:val="single" w:color="94A3B8" w:sz="4"/>
+              <w:bottom w:val="single" w:color="94A3B8" w:sz="4"/>
+              <w:right w:val="single" w:color="94A3B8" w:sz="4"/>
+            </w:tcBorders>
+            <w:tcMar>
+              <w:top w:type="dxa" w:w="40"/>
+              <w:left w:type="dxa" w:w="90"/>
+              <w:bottom w:type="dxa" w:w="40"/>
+              <w:right w:type="dxa" w:w="90"/>
+            </w:tcMar>
+          </w:tcPr>
+          <w:p>
+            <w:r>
+              <w:rPr>
+                <w:rFonts w:ascii="Calibri" w:cs="Calibri" w:eastAsia="Calibri" w:hAnsi="Calibri"/>
+                <w:sz w:val="19"/>
+                <w:szCs w:val="19"/>
+              </w:rPr>
+              <w:t xml:space="preserve">#3</w:t>
+            </w:r>
+          </w:p>
+        </w:tc>
+        <w:tc>
+          <w:tcPr>
+            <w:tcW w:type="dxa" w:w="2400"/>
+            <w:tcBorders>
+              <w:top w:val="single" w:color="94A3B8" w:sz="4"/>
+              <w:left w:val="single" w:color="94A3B8" w:sz="4"/>
+              <w:bottom w:val="single" w:color="94A3B8" w:sz="4"/>
+              <w:right w:val="single" w:color="94A3B8" w:sz="4"/>
+            </w:tcBorders>
+            <w:tcMar>
+              <w:top w:type="dxa" w:w="40"/>
+              <w:left w:type="dxa" w:w="90"/>
+              <w:bottom w:type="dxa" w:w="40"/>
+              <w:right w:type="dxa" w:w="90"/>
+            </w:tcMar>
+          </w:tcPr>
+          <w:p>
+            <w:r>
+              <w:rPr>
+                <w:rFonts w:ascii="Calibri" w:cs="Calibri" w:eastAsia="Calibri" w:hAnsi="Calibri"/>
+                <w:sz w:val="19"/>
+                <w:szCs w:val="19"/>
+              </w:rPr>
+              <w:t xml:space="preserve">GitHub push (PR #6)</w:t>
+            </w:r>
+          </w:p>
+        </w:tc>
+        <w:tc>
+          <w:tcPr>
+            <w:tcW w:type="dxa" w:w="6806"/>
+            <w:tcBorders>
+              <w:top w:val="single" w:color="94A3B8" w:sz="4"/>
+              <w:left w:val="single" w:color="94A3B8" w:sz="4"/>
+              <w:bottom w:val="single" w:color="94A3B8" w:sz="4"/>
+              <w:right w:val="single" w:color="94A3B8" w:sz="4"/>
+            </w:tcBorders>
+            <w:tcMar>
+              <w:top w:type="dxa" w:w="40"/>
+              <w:left w:type="dxa" w:w="90"/>
+              <w:bottom w:type="dxa" w:w="40"/>
+              <w:right w:type="dxa" w:w="90"/>
+            </w:tcMar>
+          </w:tcPr>
+          <w:p>
+            <w:r>
+              <w:rPr>
+                <w:rFonts w:ascii="Calibri" w:cs="Calibri" w:eastAsia="Calibri" w:hAnsi="Calibri"/>
+                <w:sz w:val="19"/>
+                <w:szCs w:val="19"/>
+              </w:rPr>
+              <w:t xml:space="preserve">All stages green; image :3 pushed and deployed.</w:t>
+            </w:r>
+          </w:p>
+        </w:tc>
+      </w:tr>
+      <w:tr>
+        <w:trPr>
+          <w:tblHeader w:val="off"/>
+        </w:trPr>
+        <w:tc>
+          <w:tcPr>
+            <w:tcW w:type="dxa" w:w="1000"/>
+            <w:tcBorders>
+              <w:top w:val="single" w:color="94A3B8" w:sz="4"/>
+              <w:left w:val="single" w:color="94A3B8" w:sz="4"/>
+              <w:bottom w:val="single" w:color="94A3B8" w:sz="4"/>
+              <w:right w:val="single" w:color="94A3B8" w:sz="4"/>
+            </w:tcBorders>
+            <w:tcMar>
+              <w:top w:type="dxa" w:w="40"/>
+              <w:left w:type="dxa" w:w="90"/>
+              <w:bottom w:type="dxa" w:w="40"/>
+              <w:right w:type="dxa" w:w="90"/>
+            </w:tcMar>
+          </w:tcPr>
+          <w:p>
+            <w:r>
+              <w:rPr>
+                <w:rFonts w:ascii="Calibri" w:cs="Calibri" w:eastAsia="Calibri" w:hAnsi="Calibri"/>
+                <w:sz w:val="19"/>
+                <w:szCs w:val="19"/>
+              </w:rPr>
+              <w:t xml:space="preserve">#4</w:t>
+            </w:r>
+          </w:p>
+        </w:tc>
+        <w:tc>
+          <w:tcPr>
+            <w:tcW w:type="dxa" w:w="2400"/>
+            <w:tcBorders>
+              <w:top w:val="single" w:color="94A3B8" w:sz="4"/>
+              <w:left w:val="single" w:color="94A3B8" w:sz="4"/>
+              <w:bottom w:val="single" w:color="94A3B8" w:sz="4"/>
+              <w:right w:val="single" w:color="94A3B8" w:sz="4"/>
+            </w:tcBorders>
+            <w:tcMar>
+              <w:top w:type="dxa" w:w="40"/>
+              <w:left w:type="dxa" w:w="90"/>
+              <w:bottom w:type="dxa" w:w="40"/>
+              <w:right w:type="dxa" w:w="90"/>
+            </w:tcMar>
+          </w:tcPr>
+          <w:p>
+            <w:r>
+              <w:rPr>
+                <w:rFonts w:ascii="Calibri" w:cs="Calibri" w:eastAsia="Calibri" w:hAnsi="Calibri"/>
+                <w:sz w:val="19"/>
+                <w:szCs w:val="19"/>
+              </w:rPr>
+              <w:t xml:space="preserve">GitHub push (PR #7)</w:t>
+            </w:r>
+          </w:p>
+        </w:tc>
+        <w:tc>
+          <w:tcPr>
+            <w:tcW w:type="dxa" w:w="6806"/>
+            <w:tcBorders>
+              <w:top w:val="single" w:color="94A3B8" w:sz="4"/>
+              <w:left w:val="single" w:color="94A3B8" w:sz="4"/>
+              <w:bottom w:val="single" w:color="94A3B8" w:sz="4"/>
+              <w:right w:val="single" w:color="94A3B8" w:sz="4"/>
+            </w:tcBorders>
+            <w:tcMar>
+              <w:top w:type="dxa" w:w="40"/>
+              <w:left w:type="dxa" w:w="90"/>
+              <w:bottom w:type="dxa" w:w="40"/>
+              <w:right w:type="dxa" w:w="90"/>
+            </w:tcMar>
+          </w:tcPr>
+          <w:p>
+            <w:r>
+              <w:rPr>
+                <w:rFonts w:ascii="Calibri" w:cs="Calibri" w:eastAsia="Calibri" w:hAnsi="Calibri"/>
+                <w:sz w:val="19"/>
+                <w:szCs w:val="19"/>
+              </w:rPr>
+              <w:t xml:space="preserve">All stages green; version 1.0.0 deployed automatically, visible at /actuator/info.</w:t>
+            </w:r>
+          </w:p>
+        </w:tc>
+      </w:tr>
+      <w:tr>
+        <w:trPr>
+          <w:tblHeader w:val="off"/>
+        </w:trPr>
+        <w:tc>
+          <w:tcPr>
+            <w:tcW w:type="dxa" w:w="1000"/>
+            <w:tcBorders>
+              <w:top w:val="single" w:color="94A3B8" w:sz="4"/>
+              <w:left w:val="single" w:color="94A3B8" w:sz="4"/>
+              <w:bottom w:val="single" w:color="94A3B8" w:sz="4"/>
+              <w:right w:val="single" w:color="94A3B8" w:sz="4"/>
+            </w:tcBorders>
+            <w:tcMar>
+              <w:top w:type="dxa" w:w="40"/>
+              <w:left w:type="dxa" w:w="90"/>
+              <w:bottom w:type="dxa" w:w="40"/>
+              <w:right w:type="dxa" w:w="90"/>
+            </w:tcMar>
+          </w:tcPr>
+          <w:p>
+            <w:r>
+              <w:rPr>
+                <w:rFonts w:ascii="Calibri" w:cs="Calibri" w:eastAsia="Calibri" w:hAnsi="Calibri"/>
+                <w:sz w:val="19"/>
+                <w:szCs w:val="19"/>
+              </w:rPr>
+              <w:t xml:space="preserve">#5</w:t>
+            </w:r>
+          </w:p>
+        </w:tc>
+        <w:tc>
+          <w:tcPr>
+            <w:tcW w:type="dxa" w:w="2400"/>
+            <w:tcBorders>
+              <w:top w:val="single" w:color="94A3B8" w:sz="4"/>
+              <w:left w:val="single" w:color="94A3B8" w:sz="4"/>
+              <w:bottom w:val="single" w:color="94A3B8" w:sz="4"/>
+              <w:right w:val="single" w:color="94A3B8" w:sz="4"/>
+            </w:tcBorders>
+            <w:tcMar>
+              <w:top w:type="dxa" w:w="40"/>
+              <w:left w:type="dxa" w:w="90"/>
+              <w:bottom w:type="dxa" w:w="40"/>
+              <w:right w:type="dxa" w:w="90"/>
+            </w:tcMar>
+          </w:tcPr>
+          <w:p>
+            <w:r>
+              <w:rPr>
+                <w:rFonts w:ascii="Calibri" w:cs="Calibri" w:eastAsia="Calibri" w:hAnsi="Calibri"/>
+                <w:sz w:val="19"/>
+                <w:szCs w:val="19"/>
+              </w:rPr>
+              <w:t xml:space="preserve">Manual re-run</w:t>
+            </w:r>
+          </w:p>
+        </w:tc>
+        <w:tc>
+          <w:tcPr>
+            <w:tcW w:type="dxa" w:w="6806"/>
+            <w:tcBorders>
+              <w:top w:val="single" w:color="94A3B8" w:sz="4"/>
+              <w:left w:val="single" w:color="94A3B8" w:sz="4"/>
+              <w:bottom w:val="single" w:color="94A3B8" w:sz="4"/>
+              <w:right w:val="single" w:color="94A3B8" w:sz="4"/>
+            </w:tcBorders>
+            <w:tcMar>
+              <w:top w:type="dxa" w:w="40"/>
+              <w:left w:type="dxa" w:w="90"/>
+              <w:bottom w:type="dxa" w:w="40"/>
+              <w:right w:type="dxa" w:w="90"/>
+            </w:tcMar>
+          </w:tcPr>
+          <w:p>
+            <w:r>
+              <w:rPr>
+                <w:rFonts w:ascii="Calibri" w:cs="Calibri" w:eastAsia="Calibri" w:hAnsi="Calibri"/>
+                <w:sz w:val="19"/>
+                <w:szCs w:val="19"/>
+              </w:rPr>
+              <w:t xml:space="preserve">All stages green; only the app container was recreated, showing the pipeline is re-runnable.</w:t>
+            </w:r>
+          </w:p>
+        </w:tc>
+      </w:tr>
+    </w:tbl>
+    <w:p>
+      <w:pPr>
+        <w:pStyle w:val="Heading1"/>
+      </w:pPr>
+      <w:r>
+        <w:rPr>
+          <w:rFonts w:ascii="Calibri" w:cs="Calibri" w:eastAsia="Calibri" w:hAnsi="Calibri"/>
+        </w:rPr>
+        <w:t xml:space="preserve">8. Challenges Faced and Solutions</w:t>
       </w:r>
     </w:p>
     <w:tbl>
@@ -1429,7 +1968,7 @@
                 <w:sz w:val="19"/>
                 <w:szCs w:val="19"/>
               </w:rPr>
-              <w:t xml:space="preserve">Jenkins (Homebrew service) could not find mvn or docker: "command not found"</w:t>
+              <w:t xml:space="preserve">Build #1 failed: "failed to connect to the docker API" after the Mac restarted</w:t>
             </w:r>
           </w:p>
         </w:tc>
@@ -1456,7 +1995,7 @@
                 <w:sz w:val="19"/>
                 <w:szCs w:val="19"/>
               </w:rPr>
-              <w:t xml:space="preserve">launchd starts services with a minimal PATH, so the Jenkinsfile prepends /opt/homebrew/bin and /usr/local/bin.</w:t>
+              <w:t xml:space="preserve">Docker Desktop does not start on its own; started it and re-ran. Documented as a pre-demo check.</w:t>
             </w:r>
           </w:p>
         </w:tc>
@@ -1488,7 +2027,7 @@
                 <w:sz w:val="19"/>
                 <w:szCs w:val="19"/>
               </w:rPr>
-              <w:t xml:space="preserve">docker login failed: docker-credential-desktop not found</w:t>
+              <w:t xml:space="preserve">Build #2 failed at Push: "unauthorized: incorrect username or password"</w:t>
             </w:r>
           </w:p>
         </w:tc>
@@ -1515,7 +2054,7 @@
                 <w:sz w:val="19"/>
                 <w:szCs w:val="19"/>
               </w:rPr>
-              <w:t xml:space="preserve">Same PATH root cause: the Docker Desktop credential helper lives in /usr/local/bin.</w:t>
+              <w:t xml:space="preserve">The image was tagged for a Docker Hub account that did not exist. Renamed the image to hades504/calculator-api in a fix branch and PR #6, whose merge triggered the first green build.</w:t>
             </w:r>
           </w:p>
         </w:tc>
@@ -1547,7 +2086,7 @@
                 <w:sz w:val="19"/>
                 <w:szCs w:val="19"/>
               </w:rPr>
-              <w:t xml:space="preserve">GitHub webhooks cannot reach localhost:8080</w:t>
+              <w:t xml:space="preserve">Homebrew-launched Jenkins starts with a minimal PATH</w:t>
             </w:r>
           </w:p>
         </w:tc>
@@ -1574,7 +2113,7 @@
                 <w:sz w:val="19"/>
                 <w:szCs w:val="19"/>
               </w:rPr>
-              <w:t xml:space="preserve">Exposed Jenkins with an ngrok static domain and pointed the webhook at /github-webhook/. Poll SCM is kept as a fallback.</w:t>
+              <w:t xml:space="preserve">The Jenkinsfile prepends /opt/homebrew/bin and /usr/local/bin so mvn, docker and the Docker credential helper are found.</w:t>
             </w:r>
           </w:p>
         </w:tc>
@@ -1606,7 +2145,7 @@
                 <w:sz w:val="19"/>
                 <w:szCs w:val="19"/>
               </w:rPr>
-              <w:t xml:space="preserve">Port conflict: Jenkins already uses 8080</w:t>
+              <w:t xml:space="preserve">GitHub webhooks cannot reach localhost:8080</w:t>
             </w:r>
           </w:p>
         </w:tc>
@@ -1633,7 +2172,7 @@
                 <w:sz w:val="19"/>
                 <w:szCs w:val="19"/>
               </w:rPr>
-              <w:t xml:space="preserve">The API is not published at all; only Nginx is, on host port 8081.</w:t>
+              <w:t xml:space="preserve">Exposed Jenkins through an ngrok static domain and pointed the webhook at /github-webhook/ (all deliveries HTTP 200). Jenkins login stays enforced; Poll SCM is kept as a fallback.</w:t>
             </w:r>
           </w:p>
         </w:tc>
@@ -1665,7 +2204,7 @@
                 <w:sz w:val="19"/>
                 <w:szCs w:val="19"/>
               </w:rPr>
-              <w:t xml:space="preserve">Nginx returned 502 after a redeploy (stale container IP)</w:t>
+              <w:t xml:space="preserve">Port conflict: Jenkins already uses 8080</w:t>
             </w:r>
           </w:p>
         </w:tc>
@@ -1692,7 +2231,7 @@
                 <w:sz w:val="19"/>
                 <w:szCs w:val="19"/>
               </w:rPr>
-              <w:t xml:space="preserve">Used resolver 127.0.0.11 with a variable proxy_pass so the app name is re-resolved.</w:t>
+              <w:t xml:space="preserve">The API is not published at all; only Nginx is, on host port 8081.</w:t>
             </w:r>
           </w:p>
         </w:tc>
@@ -1724,7 +2263,7 @@
                 <w:sz w:val="19"/>
                 <w:szCs w:val="19"/>
               </w:rPr>
-              <w:t xml:space="preserve">Gmail rejected SMTP authentication</w:t>
+              <w:t xml:space="preserve">Nginx returned 502 after the app container was recreated (stale IP)</w:t>
             </w:r>
           </w:p>
         </w:tc>
@@ -1751,7 +2290,7 @@
                 <w:sz w:val="19"/>
                 <w:szCs w:val="19"/>
               </w:rPr>
-              <w:t xml:space="preserve">Enabled 2-step verification and used a Google App Password over SSL on port 465.</w:t>
+              <w:t xml:space="preserve">Used resolver 127.0.0.11 with a variable proxy_pass so the app name is re-resolved.</w:t>
             </w:r>
           </w:p>
         </w:tc>
@@ -1783,7 +2322,7 @@
                 <w:sz w:val="19"/>
                 <w:szCs w:val="19"/>
               </w:rPr>
-              <w:t xml:space="preserve">Spring Boot 4 moved test annotations (AutoConfigureMockMvc)</w:t>
+              <w:t xml:space="preserve">Gmail refuses SMTP logins with the account password</w:t>
             </w:r>
           </w:p>
         </w:tc>
@@ -1810,7 +2349,66 @@
                 <w:sz w:val="19"/>
                 <w:szCs w:val="19"/>
               </w:rPr>
-              <w:t xml:space="preserve">Used the new spring-boot-starter-webmvc-test module and package.</w:t>
+              <w:t xml:space="preserve">Enabled 2-step verification and used a Google App Password over SSL on port 465, stored as a Jenkins credential.</w:t>
+            </w:r>
+          </w:p>
+        </w:tc>
+      </w:tr>
+      <w:tr>
+        <w:trPr>
+          <w:tblHeader w:val="off"/>
+        </w:trPr>
+        <w:tc>
+          <w:tcPr>
+            <w:tcW w:type="dxa" w:w="3600"/>
+            <w:tcBorders>
+              <w:top w:val="single" w:color="94A3B8" w:sz="4"/>
+              <w:left w:val="single" w:color="94A3B8" w:sz="4"/>
+              <w:bottom w:val="single" w:color="94A3B8" w:sz="4"/>
+              <w:right w:val="single" w:color="94A3B8" w:sz="4"/>
+            </w:tcBorders>
+            <w:tcMar>
+              <w:top w:type="dxa" w:w="40"/>
+              <w:left w:type="dxa" w:w="90"/>
+              <w:bottom w:type="dxa" w:w="40"/>
+              <w:right w:type="dxa" w:w="90"/>
+            </w:tcMar>
+          </w:tcPr>
+          <w:p>
+            <w:r>
+              <w:rPr>
+                <w:rFonts w:ascii="Calibri" w:cs="Calibri" w:eastAsia="Calibri" w:hAnsi="Calibri"/>
+                <w:sz w:val="19"/>
+                <w:szCs w:val="19"/>
+              </w:rPr>
+              <w:t xml:space="preserve">Spring Boot 4 moved the MockMvc test annotations</w:t>
+            </w:r>
+          </w:p>
+        </w:tc>
+        <w:tc>
+          <w:tcPr>
+            <w:tcW w:type="dxa" w:w="6606"/>
+            <w:tcBorders>
+              <w:top w:val="single" w:color="94A3B8" w:sz="4"/>
+              <w:left w:val="single" w:color="94A3B8" w:sz="4"/>
+              <w:bottom w:val="single" w:color="94A3B8" w:sz="4"/>
+              <w:right w:val="single" w:color="94A3B8" w:sz="4"/>
+            </w:tcBorders>
+            <w:tcMar>
+              <w:top w:type="dxa" w:w="40"/>
+              <w:left w:type="dxa" w:w="90"/>
+              <w:bottom w:type="dxa" w:w="40"/>
+              <w:right w:type="dxa" w:w="90"/>
+            </w:tcMar>
+          </w:tcPr>
+          <w:p>
+            <w:r>
+              <w:rPr>
+                <w:rFonts w:ascii="Calibri" w:cs="Calibri" w:eastAsia="Calibri" w:hAnsi="Calibri"/>
+                <w:sz w:val="19"/>
+                <w:szCs w:val="19"/>
+              </w:rPr>
+              <w:t xml:space="preserve">Used the new spring-boot-starter-webmvc-test module and its package.</w:t>
             </w:r>
           </w:p>
         </w:tc>
@@ -1819,13 +2417,12 @@
     <w:p>
       <w:pPr>
         <w:pStyle w:val="Heading1"/>
-        <w:spacing w:after="80" w:before="160"/>
-      </w:pPr>
-      <w:r>
-        <w:rPr>
-          <w:rFonts w:ascii="Calibri" w:cs="Calibri" w:eastAsia="Calibri" w:hAnsi="Calibri"/>
-        </w:rPr>
-        <w:t xml:space="preserve">8. Conclusion</w:t>
+      </w:pPr>
+      <w:r>
+        <w:rPr>
+          <w:rFonts w:ascii="Calibri" w:cs="Calibri" w:eastAsia="Calibri" w:hAnsi="Calibri"/>
+        </w:rPr>
+        <w:t xml:space="preserve">9. Conclusion</w:t>
       </w:r>
     </w:p>
     <w:p>
@@ -1838,7 +2435,7 @@
           <w:sz w:val="21"/>
           <w:szCs w:val="21"/>
         </w:rPr>
-        <w:t xml:space="preserve">Every push to main now goes from commit to a health-checked, running deployment automatically, with test results, a versioned image on Docker Hub and an email for every build. The capstone will extend the same repository with Ansible for configuration management, Kubernetes in place of Compose, and Prometheus and Grafana scraping the Actuator endpoints that already exist.</w:t>
+        <w:t xml:space="preserve">Merging a pull request now takes a change from commit to a health-checked, running deployment automatically, with published test results, a versioned image on Docker Hub and an email for every build. The capstone will extend the same repository with Ansible for configuration management, Kubernetes in place of Compose, and Prometheus and Grafana scraping the Actuator endpoints that already exist.</w:t>
       </w:r>
     </w:p>
     <w:p>
@@ -1849,7 +2446,6 @@
     <w:p>
       <w:pPr>
         <w:pStyle w:val="Heading1"/>
-        <w:spacing w:after="80" w:before="160"/>
       </w:pPr>
       <w:r>
         <w:rPr>
@@ -1860,30 +2456,54 @@
     </w:p>
     <w:p>
       <w:pPr>
-        <w:pBdr>
-          <w:top w:val="dashed" w:color="94A3B8" w:sz="6" w:space="30"/>
-          <w:left w:val="dashed" w:color="94A3B8" w:sz="6" w:space="30"/>
-          <w:bottom w:val="dashed" w:color="94A3B8" w:sz="6" w:space="30"/>
-          <w:right w:val="dashed" w:color="94A3B8" w:sz="6" w:space="30"/>
-        </w:pBdr>
-        <w:spacing w:after="60" w:before="200"/>
+        <w:keepNext/>
+        <w:spacing w:before="120"/>
         <w:jc w:val="center"/>
       </w:pPr>
       <w:r>
-        <w:rPr>
-          <w:rFonts w:ascii="Calibri" w:cs="Calibri" w:eastAsia="Calibri" w:hAnsi="Calibri"/>
-          <w:i/>
-          <w:iCs/>
-          <w:color w:val="64748B"/>
-          <w:sz w:val="21"/>
-          <w:szCs w:val="21"/>
-        </w:rPr>
-        <w:t xml:space="preserve">[ Paste screenshot here: Insert → Pictures ]</w:t>
-      </w:r>
-    </w:p>
-    <w:p>
-      <w:pPr>
-        <w:spacing w:after="160"/>
+        <w:drawing>
+          <wp:inline distT="0" distB="0" distL="0" distR="0">
+            <wp:extent cx="6286500" cy="4362450"/>
+            <wp:effectExtent t="0" r="0" b="0" l="0"/>
+            <wp:docPr id="2" name="01-jenkins-stage-view.png" descr="01-jenkins-stage-view.png" title="01-jenkins-stage-view.png"/>
+            <wp:cNvGraphicFramePr>
+              <a:graphicFrameLocks xmlns:a="http://schemas.openxmlformats.org/drawingml/2006/main" noChangeAspect="1"/>
+            </wp:cNvGraphicFramePr>
+            <a:graphic xmlns:a="http://schemas.openxmlformats.org/drawingml/2006/main">
+              <a:graphicData uri="http://schemas.openxmlformats.org/drawingml/2006/picture">
+                <pic:pic xmlns:pic="http://schemas.openxmlformats.org/drawingml/2006/picture">
+                  <pic:nvPicPr>
+                    <pic:cNvPr id="0" name="" descr=""/>
+                    <pic:cNvPicPr>
+                      <a:picLocks noChangeAspect="1" noChangeArrowheads="1"/>
+                    </pic:cNvPicPr>
+                  </pic:nvPicPr>
+                  <pic:blipFill>
+                    <a:blip r:embed="rId11" cstate="none"/>
+                    <a:srcRect/>
+                    <a:stretch>
+                      <a:fillRect/>
+                    </a:stretch>
+                  </pic:blipFill>
+                  <pic:spPr bwMode="auto">
+                    <a:xfrm>
+                      <a:off x="0" y="0"/>
+                      <a:ext cx="6286500" cy="4362450"/>
+                    </a:xfrm>
+                    <a:prstGeom prst="rect">
+                      <a:avLst/>
+                    </a:prstGeom>
+                  </pic:spPr>
+                </pic:pic>
+              </a:graphicData>
+            </a:graphic>
+          </wp:inline>
+        </w:drawing>
+      </w:r>
+    </w:p>
+    <w:p>
+      <w:pPr>
+        <w:spacing w:after="200" w:before="40"/>
         <w:jc w:val="center"/>
       </w:pPr>
       <w:r>
@@ -1894,35 +2514,59 @@
           <w:sz w:val="19"/>
           <w:szCs w:val="19"/>
         </w:rPr>
-        <w:t xml:space="preserve">Figure A1: Jenkins Stage View, all stages green (build started by GitHub push)</w:t>
-      </w:r>
-    </w:p>
-    <w:p>
-      <w:pPr>
-        <w:pBdr>
-          <w:top w:val="dashed" w:color="94A3B8" w:sz="6" w:space="30"/>
-          <w:left w:val="dashed" w:color="94A3B8" w:sz="6" w:space="30"/>
-          <w:bottom w:val="dashed" w:color="94A3B8" w:sz="6" w:space="30"/>
-          <w:right w:val="dashed" w:color="94A3B8" w:sz="6" w:space="30"/>
-        </w:pBdr>
-        <w:spacing w:after="60" w:before="200"/>
+        <w:t xml:space="preserve">Figure A1: Jenkins Stage View for builds #1–#5 and the test result trend</w:t>
+      </w:r>
+    </w:p>
+    <w:p>
+      <w:pPr>
+        <w:keepNext/>
+        <w:spacing w:before="120"/>
         <w:jc w:val="center"/>
       </w:pPr>
       <w:r>
-        <w:rPr>
-          <w:rFonts w:ascii="Calibri" w:cs="Calibri" w:eastAsia="Calibri" w:hAnsi="Calibri"/>
-          <w:i/>
-          <w:iCs/>
-          <w:color w:val="64748B"/>
-          <w:sz w:val="21"/>
-          <w:szCs w:val="21"/>
-        </w:rPr>
-        <w:t xml:space="preserve">[ Paste screenshot here: Insert → Pictures ]</w:t>
-      </w:r>
-    </w:p>
-    <w:p>
-      <w:pPr>
-        <w:spacing w:after="160"/>
+        <w:drawing>
+          <wp:inline distT="0" distB="0" distL="0" distR="0">
+            <wp:extent cx="6286500" cy="3057525"/>
+            <wp:effectExtent t="0" r="0" b="0" l="0"/>
+            <wp:docPr id="3" name="02-jenkins-build-github-push.png" descr="02-jenkins-build-github-push.png" title="02-jenkins-build-github-push.png"/>
+            <wp:cNvGraphicFramePr>
+              <a:graphicFrameLocks xmlns:a="http://schemas.openxmlformats.org/drawingml/2006/main" noChangeAspect="1"/>
+            </wp:cNvGraphicFramePr>
+            <a:graphic xmlns:a="http://schemas.openxmlformats.org/drawingml/2006/main">
+              <a:graphicData uri="http://schemas.openxmlformats.org/drawingml/2006/picture">
+                <pic:pic xmlns:pic="http://schemas.openxmlformats.org/drawingml/2006/picture">
+                  <pic:nvPicPr>
+                    <pic:cNvPr id="0" name="" descr=""/>
+                    <pic:cNvPicPr>
+                      <a:picLocks noChangeAspect="1" noChangeArrowheads="1"/>
+                    </pic:cNvPicPr>
+                  </pic:nvPicPr>
+                  <pic:blipFill>
+                    <a:blip r:embed="rId12" cstate="none"/>
+                    <a:srcRect/>
+                    <a:stretch>
+                      <a:fillRect/>
+                    </a:stretch>
+                  </pic:blipFill>
+                  <pic:spPr bwMode="auto">
+                    <a:xfrm>
+                      <a:off x="0" y="0"/>
+                      <a:ext cx="6286500" cy="3057525"/>
+                    </a:xfrm>
+                    <a:prstGeom prst="rect">
+                      <a:avLst/>
+                    </a:prstGeom>
+                  </pic:spPr>
+                </pic:pic>
+              </a:graphicData>
+            </a:graphic>
+          </wp:inline>
+        </w:drawing>
+      </w:r>
+    </w:p>
+    <w:p>
+      <w:pPr>
+        <w:spacing w:after="200" w:before="40"/>
         <w:jc w:val="center"/>
       </w:pPr>
       <w:r>
@@ -1933,35 +2577,59 @@
           <w:sz w:val="19"/>
           <w:szCs w:val="19"/>
         </w:rPr>
-        <w:t xml:space="preserve">Figure A2: Jenkins Test Result: 57 tests, 0 failures</w:t>
-      </w:r>
-    </w:p>
-    <w:p>
-      <w:pPr>
-        <w:pBdr>
-          <w:top w:val="dashed" w:color="94A3B8" w:sz="6" w:space="30"/>
-          <w:left w:val="dashed" w:color="94A3B8" w:sz="6" w:space="30"/>
-          <w:bottom w:val="dashed" w:color="94A3B8" w:sz="6" w:space="30"/>
-          <w:right w:val="dashed" w:color="94A3B8" w:sz="6" w:space="30"/>
-        </w:pBdr>
-        <w:spacing w:after="60" w:before="200"/>
+        <w:t xml:space="preserve">Figure A2: Build #4, started by a GitHub push (merge of PR #7, Release 1.0.0)</w:t>
+      </w:r>
+    </w:p>
+    <w:p>
+      <w:pPr>
+        <w:keepNext/>
+        <w:spacing w:before="120"/>
         <w:jc w:val="center"/>
       </w:pPr>
       <w:r>
-        <w:rPr>
-          <w:rFonts w:ascii="Calibri" w:cs="Calibri" w:eastAsia="Calibri" w:hAnsi="Calibri"/>
-          <w:i/>
-          <w:iCs/>
-          <w:color w:val="64748B"/>
-          <w:sz w:val="21"/>
-          <w:szCs w:val="21"/>
-        </w:rPr>
-        <w:t xml:space="preserve">[ Paste screenshot here: Insert → Pictures ]</w:t>
-      </w:r>
-    </w:p>
-    <w:p>
-      <w:pPr>
-        <w:spacing w:after="160"/>
+        <w:drawing>
+          <wp:inline distT="0" distB="0" distL="0" distR="0">
+            <wp:extent cx="6286500" cy="3714750"/>
+            <wp:effectExtent t="0" r="0" b="0" l="0"/>
+            <wp:docPr id="4" name="03-jenkins-test-results.png" descr="03-jenkins-test-results.png" title="03-jenkins-test-results.png"/>
+            <wp:cNvGraphicFramePr>
+              <a:graphicFrameLocks xmlns:a="http://schemas.openxmlformats.org/drawingml/2006/main" noChangeAspect="1"/>
+            </wp:cNvGraphicFramePr>
+            <a:graphic xmlns:a="http://schemas.openxmlformats.org/drawingml/2006/main">
+              <a:graphicData uri="http://schemas.openxmlformats.org/drawingml/2006/picture">
+                <pic:pic xmlns:pic="http://schemas.openxmlformats.org/drawingml/2006/picture">
+                  <pic:nvPicPr>
+                    <pic:cNvPr id="0" name="" descr=""/>
+                    <pic:cNvPicPr>
+                      <a:picLocks noChangeAspect="1" noChangeArrowheads="1"/>
+                    </pic:cNvPicPr>
+                  </pic:nvPicPr>
+                  <pic:blipFill>
+                    <a:blip r:embed="rId13" cstate="none"/>
+                    <a:srcRect/>
+                    <a:stretch>
+                      <a:fillRect/>
+                    </a:stretch>
+                  </pic:blipFill>
+                  <pic:spPr bwMode="auto">
+                    <a:xfrm>
+                      <a:off x="0" y="0"/>
+                      <a:ext cx="6286500" cy="3714750"/>
+                    </a:xfrm>
+                    <a:prstGeom prst="rect">
+                      <a:avLst/>
+                    </a:prstGeom>
+                  </pic:spPr>
+                </pic:pic>
+              </a:graphicData>
+            </a:graphic>
+          </wp:inline>
+        </w:drawing>
+      </w:r>
+    </w:p>
+    <w:p>
+      <w:pPr>
+        <w:spacing w:after="200" w:before="40"/>
         <w:jc w:val="center"/>
       </w:pPr>
       <w:r>
@@ -1972,35 +2640,59 @@
           <w:sz w:val="19"/>
           <w:szCs w:val="19"/>
         </w:rPr>
-        <w:t xml:space="preserve">Figure A3: Build notification email (SUCCESS / FAILURE)</w:t>
-      </w:r>
-    </w:p>
-    <w:p>
-      <w:pPr>
-        <w:pBdr>
-          <w:top w:val="dashed" w:color="94A3B8" w:sz="6" w:space="30"/>
-          <w:left w:val="dashed" w:color="94A3B8" w:sz="6" w:space="30"/>
-          <w:bottom w:val="dashed" w:color="94A3B8" w:sz="6" w:space="30"/>
-          <w:right w:val="dashed" w:color="94A3B8" w:sz="6" w:space="30"/>
-        </w:pBdr>
-        <w:spacing w:after="60" w:before="200"/>
+        <w:t xml:space="preserve">Figure A3: Jenkins test report: 57 tests, 0 failures</w:t>
+      </w:r>
+    </w:p>
+    <w:p>
+      <w:pPr>
+        <w:keepNext/>
+        <w:spacing w:before="120"/>
         <w:jc w:val="center"/>
       </w:pPr>
       <w:r>
-        <w:rPr>
-          <w:rFonts w:ascii="Calibri" w:cs="Calibri" w:eastAsia="Calibri" w:hAnsi="Calibri"/>
-          <w:i/>
-          <w:iCs/>
-          <w:color w:val="64748B"/>
-          <w:sz w:val="21"/>
-          <w:szCs w:val="21"/>
-        </w:rPr>
-        <w:t xml:space="preserve">[ Paste screenshot here: Insert → Pictures ]</w:t>
-      </w:r>
-    </w:p>
-    <w:p>
-      <w:pPr>
-        <w:spacing w:after="160"/>
+        <w:drawing>
+          <wp:inline distT="0" distB="0" distL="0" distR="0">
+            <wp:extent cx="6286500" cy="3933825"/>
+            <wp:effectExtent t="0" r="0" b="0" l="0"/>
+            <wp:docPr id="5" name="04-jenkins-deploy-log.png" descr="04-jenkins-deploy-log.png" title="04-jenkins-deploy-log.png"/>
+            <wp:cNvGraphicFramePr>
+              <a:graphicFrameLocks xmlns:a="http://schemas.openxmlformats.org/drawingml/2006/main" noChangeAspect="1"/>
+            </wp:cNvGraphicFramePr>
+            <a:graphic xmlns:a="http://schemas.openxmlformats.org/drawingml/2006/main">
+              <a:graphicData uri="http://schemas.openxmlformats.org/drawingml/2006/picture">
+                <pic:pic xmlns:pic="http://schemas.openxmlformats.org/drawingml/2006/picture">
+                  <pic:nvPicPr>
+                    <pic:cNvPr id="0" name="" descr=""/>
+                    <pic:cNvPicPr>
+                      <a:picLocks noChangeAspect="1" noChangeArrowheads="1"/>
+                    </pic:cNvPicPr>
+                  </pic:nvPicPr>
+                  <pic:blipFill>
+                    <a:blip r:embed="rId14" cstate="none"/>
+                    <a:srcRect/>
+                    <a:stretch>
+                      <a:fillRect/>
+                    </a:stretch>
+                  </pic:blipFill>
+                  <pic:spPr bwMode="auto">
+                    <a:xfrm>
+                      <a:off x="0" y="0"/>
+                      <a:ext cx="6286500" cy="3933825"/>
+                    </a:xfrm>
+                    <a:prstGeom prst="rect">
+                      <a:avLst/>
+                    </a:prstGeom>
+                  </pic:spPr>
+                </pic:pic>
+              </a:graphicData>
+            </a:graphic>
+          </wp:inline>
+        </w:drawing>
+      </w:r>
+    </w:p>
+    <w:p>
+      <w:pPr>
+        <w:spacing w:after="200" w:before="40"/>
         <w:jc w:val="center"/>
       </w:pPr>
       <w:r>
@@ -2011,35 +2703,59 @@
           <w:sz w:val="19"/>
           <w:szCs w:val="19"/>
         </w:rPr>
-        <w:t xml:space="preserve">Figure A4: docker ps / docker compose ps showing both containers healthy</w:t>
-      </w:r>
-    </w:p>
-    <w:p>
-      <w:pPr>
-        <w:pBdr>
-          <w:top w:val="dashed" w:color="94A3B8" w:sz="6" w:space="30"/>
-          <w:left w:val="dashed" w:color="94A3B8" w:sz="6" w:space="30"/>
-          <w:bottom w:val="dashed" w:color="94A3B8" w:sz="6" w:space="30"/>
-          <w:right w:val="dashed" w:color="94A3B8" w:sz="6" w:space="30"/>
-        </w:pBdr>
-        <w:spacing w:after="60" w:before="200"/>
+        <w:t xml:space="preserve">Figure A4: Deploy stage log: compose recreates only the app, health check UP, smoke tests pass</w:t>
+      </w:r>
+    </w:p>
+    <w:p>
+      <w:pPr>
+        <w:keepNext/>
+        <w:spacing w:before="120"/>
         <w:jc w:val="center"/>
       </w:pPr>
       <w:r>
-        <w:rPr>
-          <w:rFonts w:ascii="Calibri" w:cs="Calibri" w:eastAsia="Calibri" w:hAnsi="Calibri"/>
-          <w:i/>
-          <w:iCs/>
-          <w:color w:val="64748B"/>
-          <w:sz w:val="21"/>
-          <w:szCs w:val="21"/>
-        </w:rPr>
-        <w:t xml:space="preserve">[ Paste screenshot here: Insert → Pictures ]</w:t>
-      </w:r>
-    </w:p>
-    <w:p>
-      <w:pPr>
-        <w:spacing w:after="160"/>
+        <w:drawing>
+          <wp:inline distT="0" distB="0" distL="0" distR="0">
+            <wp:extent cx="6286500" cy="2076450"/>
+            <wp:effectExtent t="0" r="0" b="0" l="0"/>
+            <wp:docPr id="6" name="12-email.png" descr="12-email.png" title="12-email.png"/>
+            <wp:cNvGraphicFramePr>
+              <a:graphicFrameLocks xmlns:a="http://schemas.openxmlformats.org/drawingml/2006/main" noChangeAspect="1"/>
+            </wp:cNvGraphicFramePr>
+            <a:graphic xmlns:a="http://schemas.openxmlformats.org/drawingml/2006/main">
+              <a:graphicData uri="http://schemas.openxmlformats.org/drawingml/2006/picture">
+                <pic:pic xmlns:pic="http://schemas.openxmlformats.org/drawingml/2006/picture">
+                  <pic:nvPicPr>
+                    <pic:cNvPr id="0" name="" descr=""/>
+                    <pic:cNvPicPr>
+                      <a:picLocks noChangeAspect="1" noChangeArrowheads="1"/>
+                    </pic:cNvPicPr>
+                  </pic:nvPicPr>
+                  <pic:blipFill>
+                    <a:blip r:embed="rId15" cstate="none"/>
+                    <a:srcRect/>
+                    <a:stretch>
+                      <a:fillRect/>
+                    </a:stretch>
+                  </pic:blipFill>
+                  <pic:spPr bwMode="auto">
+                    <a:xfrm>
+                      <a:off x="0" y="0"/>
+                      <a:ext cx="6286500" cy="2076450"/>
+                    </a:xfrm>
+                    <a:prstGeom prst="rect">
+                      <a:avLst/>
+                    </a:prstGeom>
+                  </pic:spPr>
+                </pic:pic>
+              </a:graphicData>
+            </a:graphic>
+          </wp:inline>
+        </w:drawing>
+      </w:r>
+    </w:p>
+    <w:p>
+      <w:pPr>
+        <w:spacing w:after="200" w:before="40"/>
         <w:jc w:val="center"/>
       </w:pPr>
       <w:r>
@@ -2050,35 +2766,59 @@
           <w:sz w:val="19"/>
           <w:szCs w:val="19"/>
         </w:rPr>
-        <w:t xml:space="preserve">Figure A5: Sample API responses (curl), including HTTP 400 error bodies</w:t>
-      </w:r>
-    </w:p>
-    <w:p>
-      <w:pPr>
-        <w:pBdr>
-          <w:top w:val="dashed" w:color="94A3B8" w:sz="6" w:space="30"/>
-          <w:left w:val="dashed" w:color="94A3B8" w:sz="6" w:space="30"/>
-          <w:bottom w:val="dashed" w:color="94A3B8" w:sz="6" w:space="30"/>
-          <w:right w:val="dashed" w:color="94A3B8" w:sz="6" w:space="30"/>
-        </w:pBdr>
-        <w:spacing w:after="60" w:before="200"/>
+        <w:t xml:space="preserve">Figure A5: Build notification email from Jenkins</w:t>
+      </w:r>
+    </w:p>
+    <w:p>
+      <w:pPr>
+        <w:keepNext/>
+        <w:spacing w:before="120"/>
         <w:jc w:val="center"/>
       </w:pPr>
       <w:r>
-        <w:rPr>
-          <w:rFonts w:ascii="Calibri" w:cs="Calibri" w:eastAsia="Calibri" w:hAnsi="Calibri"/>
-          <w:i/>
-          <w:iCs/>
-          <w:color w:val="64748B"/>
-          <w:sz w:val="21"/>
-          <w:szCs w:val="21"/>
-        </w:rPr>
-        <w:t xml:space="preserve">[ Paste screenshot here: Insert → Pictures ]</w:t>
-      </w:r>
-    </w:p>
-    <w:p>
-      <w:pPr>
-        <w:spacing w:after="160"/>
+        <w:drawing>
+          <wp:inline distT="0" distB="0" distL="0" distR="0">
+            <wp:extent cx="6286500" cy="1543050"/>
+            <wp:effectExtent t="0" r="0" b="0" l="0"/>
+            <wp:docPr id="7" name="05-docker-ps.png" descr="05-docker-ps.png" title="05-docker-ps.png"/>
+            <wp:cNvGraphicFramePr>
+              <a:graphicFrameLocks xmlns:a="http://schemas.openxmlformats.org/drawingml/2006/main" noChangeAspect="1"/>
+            </wp:cNvGraphicFramePr>
+            <a:graphic xmlns:a="http://schemas.openxmlformats.org/drawingml/2006/main">
+              <a:graphicData uri="http://schemas.openxmlformats.org/drawingml/2006/picture">
+                <pic:pic xmlns:pic="http://schemas.openxmlformats.org/drawingml/2006/picture">
+                  <pic:nvPicPr>
+                    <pic:cNvPr id="0" name="" descr=""/>
+                    <pic:cNvPicPr>
+                      <a:picLocks noChangeAspect="1" noChangeArrowheads="1"/>
+                    </pic:cNvPicPr>
+                  </pic:nvPicPr>
+                  <pic:blipFill>
+                    <a:blip r:embed="rId16" cstate="none"/>
+                    <a:srcRect/>
+                    <a:stretch>
+                      <a:fillRect/>
+                    </a:stretch>
+                  </pic:blipFill>
+                  <pic:spPr bwMode="auto">
+                    <a:xfrm>
+                      <a:off x="0" y="0"/>
+                      <a:ext cx="6286500" cy="1543050"/>
+                    </a:xfrm>
+                    <a:prstGeom prst="rect">
+                      <a:avLst/>
+                    </a:prstGeom>
+                  </pic:spPr>
+                </pic:pic>
+              </a:graphicData>
+            </a:graphic>
+          </wp:inline>
+        </w:drawing>
+      </w:r>
+    </w:p>
+    <w:p>
+      <w:pPr>
+        <w:spacing w:after="200" w:before="40"/>
         <w:jc w:val="center"/>
       </w:pPr>
       <w:r>
@@ -2089,35 +2829,59 @@
           <w:sz w:val="19"/>
           <w:szCs w:val="19"/>
         </w:rPr>
-        <w:t xml:space="preserve">Figure A6: Docker Hub tags for nirbhaysharma504/calculator-api</w:t>
-      </w:r>
-    </w:p>
-    <w:p>
-      <w:pPr>
-        <w:pBdr>
-          <w:top w:val="dashed" w:color="94A3B8" w:sz="6" w:space="30"/>
-          <w:left w:val="dashed" w:color="94A3B8" w:sz="6" w:space="30"/>
-          <w:bottom w:val="dashed" w:color="94A3B8" w:sz="6" w:space="30"/>
-          <w:right w:val="dashed" w:color="94A3B8" w:sz="6" w:space="30"/>
-        </w:pBdr>
-        <w:spacing w:after="60" w:before="200"/>
+        <w:t xml:space="preserve">Figure A6: docker ps / docker compose ps: both containers healthy, app running build #5</w:t>
+      </w:r>
+    </w:p>
+    <w:p>
+      <w:pPr>
+        <w:keepNext/>
+        <w:spacing w:before="120"/>
         <w:jc w:val="center"/>
       </w:pPr>
       <w:r>
-        <w:rPr>
-          <w:rFonts w:ascii="Calibri" w:cs="Calibri" w:eastAsia="Calibri" w:hAnsi="Calibri"/>
-          <w:i/>
-          <w:iCs/>
-          <w:color w:val="64748B"/>
-          <w:sz w:val="21"/>
-          <w:szCs w:val="21"/>
-        </w:rPr>
-        <w:t xml:space="preserve">[ Paste screenshot here: Insert → Pictures ]</w:t>
-      </w:r>
-    </w:p>
-    <w:p>
-      <w:pPr>
-        <w:spacing w:after="160"/>
+        <w:drawing>
+          <wp:inline distT="0" distB="0" distL="0" distR="0">
+            <wp:extent cx="6286500" cy="2447925"/>
+            <wp:effectExtent t="0" r="0" b="0" l="0"/>
+            <wp:docPr id="8" name="06-api-responses.png" descr="06-api-responses.png" title="06-api-responses.png"/>
+            <wp:cNvGraphicFramePr>
+              <a:graphicFrameLocks xmlns:a="http://schemas.openxmlformats.org/drawingml/2006/main" noChangeAspect="1"/>
+            </wp:cNvGraphicFramePr>
+            <a:graphic xmlns:a="http://schemas.openxmlformats.org/drawingml/2006/main">
+              <a:graphicData uri="http://schemas.openxmlformats.org/drawingml/2006/picture">
+                <pic:pic xmlns:pic="http://schemas.openxmlformats.org/drawingml/2006/picture">
+                  <pic:nvPicPr>
+                    <pic:cNvPr id="0" name="" descr=""/>
+                    <pic:cNvPicPr>
+                      <a:picLocks noChangeAspect="1" noChangeArrowheads="1"/>
+                    </pic:cNvPicPr>
+                  </pic:nvPicPr>
+                  <pic:blipFill>
+                    <a:blip r:embed="rId17" cstate="none"/>
+                    <a:srcRect/>
+                    <a:stretch>
+                      <a:fillRect/>
+                    </a:stretch>
+                  </pic:blipFill>
+                  <pic:spPr bwMode="auto">
+                    <a:xfrm>
+                      <a:off x="0" y="0"/>
+                      <a:ext cx="6286500" cy="2447925"/>
+                    </a:xfrm>
+                    <a:prstGeom prst="rect">
+                      <a:avLst/>
+                    </a:prstGeom>
+                  </pic:spPr>
+                </pic:pic>
+              </a:graphicData>
+            </a:graphic>
+          </wp:inline>
+        </w:drawing>
+      </w:r>
+    </w:p>
+    <w:p>
+      <w:pPr>
+        <w:spacing w:after="200" w:before="40"/>
         <w:jc w:val="center"/>
       </w:pPr>
       <w:r>
@@ -2128,35 +2892,59 @@
           <w:sz w:val="19"/>
           <w:szCs w:val="19"/>
         </w:rPr>
-        <w:t xml:space="preserve">Figure A7: GitHub merged pull requests and commit history / network graph</w:t>
-      </w:r>
-    </w:p>
-    <w:p>
-      <w:pPr>
-        <w:pBdr>
-          <w:top w:val="dashed" w:color="94A3B8" w:sz="6" w:space="30"/>
-          <w:left w:val="dashed" w:color="94A3B8" w:sz="6" w:space="30"/>
-          <w:bottom w:val="dashed" w:color="94A3B8" w:sz="6" w:space="30"/>
-          <w:right w:val="dashed" w:color="94A3B8" w:sz="6" w:space="30"/>
-        </w:pBdr>
-        <w:spacing w:after="60" w:before="200"/>
+        <w:t xml:space="preserve">Figure A7: Sample API responses through Nginx, including HTTP 400 error bodies and version 1.0.0</w:t>
+      </w:r>
+    </w:p>
+    <w:p>
+      <w:pPr>
+        <w:keepNext/>
+        <w:spacing w:before="120"/>
         <w:jc w:val="center"/>
       </w:pPr>
       <w:r>
-        <w:rPr>
-          <w:rFonts w:ascii="Calibri" w:cs="Calibri" w:eastAsia="Calibri" w:hAnsi="Calibri"/>
-          <w:i/>
-          <w:iCs/>
-          <w:color w:val="64748B"/>
-          <w:sz w:val="21"/>
-          <w:szCs w:val="21"/>
-        </w:rPr>
-        <w:t xml:space="preserve">[ Paste screenshot here: Insert → Pictures ]</w:t>
-      </w:r>
-    </w:p>
-    <w:p>
-      <w:pPr>
-        <w:spacing w:after="160"/>
+        <w:drawing>
+          <wp:inline distT="0" distB="0" distL="0" distR="0">
+            <wp:extent cx="6286500" cy="3619500"/>
+            <wp:effectExtent t="0" r="0" b="0" l="0"/>
+            <wp:docPr id="9" name="10-dockerhub-tags.png" descr="10-dockerhub-tags.png" title="10-dockerhub-tags.png"/>
+            <wp:cNvGraphicFramePr>
+              <a:graphicFrameLocks xmlns:a="http://schemas.openxmlformats.org/drawingml/2006/main" noChangeAspect="1"/>
+            </wp:cNvGraphicFramePr>
+            <a:graphic xmlns:a="http://schemas.openxmlformats.org/drawingml/2006/main">
+              <a:graphicData uri="http://schemas.openxmlformats.org/drawingml/2006/picture">
+                <pic:pic xmlns:pic="http://schemas.openxmlformats.org/drawingml/2006/picture">
+                  <pic:nvPicPr>
+                    <pic:cNvPr id="0" name="" descr=""/>
+                    <pic:cNvPicPr>
+                      <a:picLocks noChangeAspect="1" noChangeArrowheads="1"/>
+                    </pic:cNvPicPr>
+                  </pic:nvPicPr>
+                  <pic:blipFill>
+                    <a:blip r:embed="rId18" cstate="none"/>
+                    <a:srcRect/>
+                    <a:stretch>
+                      <a:fillRect/>
+                    </a:stretch>
+                  </pic:blipFill>
+                  <pic:spPr bwMode="auto">
+                    <a:xfrm>
+                      <a:off x="0" y="0"/>
+                      <a:ext cx="6286500" cy="3619500"/>
+                    </a:xfrm>
+                    <a:prstGeom prst="rect">
+                      <a:avLst/>
+                    </a:prstGeom>
+                  </pic:spPr>
+                </pic:pic>
+              </a:graphicData>
+            </a:graphic>
+          </wp:inline>
+        </w:drawing>
+      </w:r>
+    </w:p>
+    <w:p>
+      <w:pPr>
+        <w:spacing w:after="200" w:before="40"/>
         <w:jc w:val="center"/>
       </w:pPr>
       <w:r>
@@ -2167,7 +2955,259 @@
           <w:sz w:val="19"/>
           <w:szCs w:val="19"/>
         </w:rPr>
-        <w:t xml:space="preserve">Figure A8: GitHub webhook Recent Deliveries (HTTP 200)</w:t>
+        <w:t xml:space="preserve">Figure A8: Docker Hub repository hades504/calculator-api with build-number tags</w:t>
+      </w:r>
+    </w:p>
+    <w:p>
+      <w:pPr>
+        <w:keepNext/>
+        <w:spacing w:before="120"/>
+        <w:jc w:val="center"/>
+      </w:pPr>
+      <w:r>
+        <w:drawing>
+          <wp:inline distT="0" distB="0" distL="0" distR="0">
+            <wp:extent cx="6286500" cy="3314700"/>
+            <wp:effectExtent t="0" r="0" b="0" l="0"/>
+            <wp:docPr id="10" name="09-github-pull-requests.png" descr="09-github-pull-requests.png" title="09-github-pull-requests.png"/>
+            <wp:cNvGraphicFramePr>
+              <a:graphicFrameLocks xmlns:a="http://schemas.openxmlformats.org/drawingml/2006/main" noChangeAspect="1"/>
+            </wp:cNvGraphicFramePr>
+            <a:graphic xmlns:a="http://schemas.openxmlformats.org/drawingml/2006/main">
+              <a:graphicData uri="http://schemas.openxmlformats.org/drawingml/2006/picture">
+                <pic:pic xmlns:pic="http://schemas.openxmlformats.org/drawingml/2006/picture">
+                  <pic:nvPicPr>
+                    <pic:cNvPr id="0" name="" descr=""/>
+                    <pic:cNvPicPr>
+                      <a:picLocks noChangeAspect="1" noChangeArrowheads="1"/>
+                    </pic:cNvPicPr>
+                  </pic:nvPicPr>
+                  <pic:blipFill>
+                    <a:blip r:embed="rId19" cstate="none"/>
+                    <a:srcRect/>
+                    <a:stretch>
+                      <a:fillRect/>
+                    </a:stretch>
+                  </pic:blipFill>
+                  <pic:spPr bwMode="auto">
+                    <a:xfrm>
+                      <a:off x="0" y="0"/>
+                      <a:ext cx="6286500" cy="3314700"/>
+                    </a:xfrm>
+                    <a:prstGeom prst="rect">
+                      <a:avLst/>
+                    </a:prstGeom>
+                  </pic:spPr>
+                </pic:pic>
+              </a:graphicData>
+            </a:graphic>
+          </wp:inline>
+        </w:drawing>
+      </w:r>
+    </w:p>
+    <w:p>
+      <w:pPr>
+        <w:spacing w:after="200" w:before="40"/>
+        <w:jc w:val="center"/>
+      </w:pPr>
+      <w:r>
+        <w:rPr>
+          <w:rFonts w:ascii="Calibri" w:cs="Calibri" w:eastAsia="Calibri" w:hAnsi="Calibri"/>
+          <w:i/>
+          <w:iCs/>
+          <w:sz w:val="19"/>
+          <w:szCs w:val="19"/>
+        </w:rPr>
+        <w:t xml:space="preserve">Figure A9: GitHub pull requests: 7 feature branches merged into main</w:t>
+      </w:r>
+    </w:p>
+    <w:p>
+      <w:pPr>
+        <w:keepNext/>
+        <w:spacing w:before="120"/>
+        <w:jc w:val="center"/>
+      </w:pPr>
+      <w:r>
+        <w:drawing>
+          <wp:inline distT="0" distB="0" distL="0" distR="0">
+            <wp:extent cx="6286500" cy="4714875"/>
+            <wp:effectExtent t="0" r="0" b="0" l="0"/>
+            <wp:docPr id="11" name="07-git-history.png" descr="07-git-history.png" title="07-git-history.png"/>
+            <wp:cNvGraphicFramePr>
+              <a:graphicFrameLocks xmlns:a="http://schemas.openxmlformats.org/drawingml/2006/main" noChangeAspect="1"/>
+            </wp:cNvGraphicFramePr>
+            <a:graphic xmlns:a="http://schemas.openxmlformats.org/drawingml/2006/main">
+              <a:graphicData uri="http://schemas.openxmlformats.org/drawingml/2006/picture">
+                <pic:pic xmlns:pic="http://schemas.openxmlformats.org/drawingml/2006/picture">
+                  <pic:nvPicPr>
+                    <pic:cNvPr id="0" name="" descr=""/>
+                    <pic:cNvPicPr>
+                      <a:picLocks noChangeAspect="1" noChangeArrowheads="1"/>
+                    </pic:cNvPicPr>
+                  </pic:nvPicPr>
+                  <pic:blipFill>
+                    <a:blip r:embed="rId20" cstate="none"/>
+                    <a:srcRect/>
+                    <a:stretch>
+                      <a:fillRect/>
+                    </a:stretch>
+                  </pic:blipFill>
+                  <pic:spPr bwMode="auto">
+                    <a:xfrm>
+                      <a:off x="0" y="0"/>
+                      <a:ext cx="6286500" cy="4714875"/>
+                    </a:xfrm>
+                    <a:prstGeom prst="rect">
+                      <a:avLst/>
+                    </a:prstGeom>
+                  </pic:spPr>
+                </pic:pic>
+              </a:graphicData>
+            </a:graphic>
+          </wp:inline>
+        </w:drawing>
+      </w:r>
+    </w:p>
+    <w:p>
+      <w:pPr>
+        <w:spacing w:after="200" w:before="40"/>
+        <w:jc w:val="center"/>
+      </w:pPr>
+      <w:r>
+        <w:rPr>
+          <w:rFonts w:ascii="Calibri" w:cs="Calibri" w:eastAsia="Calibri" w:hAnsi="Calibri"/>
+          <w:i/>
+          <w:iCs/>
+          <w:sz w:val="19"/>
+          <w:szCs w:val="19"/>
+        </w:rPr>
+        <w:t xml:space="preserve">Figure A10: Commit history of main showing each feature branch merged</w:t>
+      </w:r>
+    </w:p>
+    <w:p>
+      <w:pPr>
+        <w:keepNext/>
+        <w:spacing w:before="120"/>
+        <w:jc w:val="center"/>
+      </w:pPr>
+      <w:r>
+        <w:drawing>
+          <wp:inline distT="0" distB="0" distL="0" distR="0">
+            <wp:extent cx="6286500" cy="1685925"/>
+            <wp:effectExtent t="0" r="0" b="0" l="0"/>
+            <wp:docPr id="12" name="08-webhook-deliveries.png" descr="08-webhook-deliveries.png" title="08-webhook-deliveries.png"/>
+            <wp:cNvGraphicFramePr>
+              <a:graphicFrameLocks xmlns:a="http://schemas.openxmlformats.org/drawingml/2006/main" noChangeAspect="1"/>
+            </wp:cNvGraphicFramePr>
+            <a:graphic xmlns:a="http://schemas.openxmlformats.org/drawingml/2006/main">
+              <a:graphicData uri="http://schemas.openxmlformats.org/drawingml/2006/picture">
+                <pic:pic xmlns:pic="http://schemas.openxmlformats.org/drawingml/2006/picture">
+                  <pic:nvPicPr>
+                    <pic:cNvPr id="0" name="" descr=""/>
+                    <pic:cNvPicPr>
+                      <a:picLocks noChangeAspect="1" noChangeArrowheads="1"/>
+                    </pic:cNvPicPr>
+                  </pic:nvPicPr>
+                  <pic:blipFill>
+                    <a:blip r:embed="rId21" cstate="none"/>
+                    <a:srcRect/>
+                    <a:stretch>
+                      <a:fillRect/>
+                    </a:stretch>
+                  </pic:blipFill>
+                  <pic:spPr bwMode="auto">
+                    <a:xfrm>
+                      <a:off x="0" y="0"/>
+                      <a:ext cx="6286500" cy="1685925"/>
+                    </a:xfrm>
+                    <a:prstGeom prst="rect">
+                      <a:avLst/>
+                    </a:prstGeom>
+                  </pic:spPr>
+                </pic:pic>
+              </a:graphicData>
+            </a:graphic>
+          </wp:inline>
+        </w:drawing>
+      </w:r>
+    </w:p>
+    <w:p>
+      <w:pPr>
+        <w:spacing w:after="200" w:before="40"/>
+        <w:jc w:val="center"/>
+      </w:pPr>
+      <w:r>
+        <w:rPr>
+          <w:rFonts w:ascii="Calibri" w:cs="Calibri" w:eastAsia="Calibri" w:hAnsi="Calibri"/>
+          <w:i/>
+          <w:iCs/>
+          <w:sz w:val="19"/>
+          <w:szCs w:val="19"/>
+        </w:rPr>
+        <w:t xml:space="preserve">Figure A11: GitHub webhook to Jenkins (via ngrok): every delivery returned HTTP 200</w:t>
+      </w:r>
+    </w:p>
+    <w:p>
+      <w:pPr>
+        <w:keepNext/>
+        <w:spacing w:before="120"/>
+        <w:jc w:val="center"/>
+      </w:pPr>
+      <w:r>
+        <w:drawing>
+          <wp:inline distT="0" distB="0" distL="0" distR="0">
+            <wp:extent cx="6286500" cy="3619500"/>
+            <wp:effectExtent t="0" r="0" b="0" l="0"/>
+            <wp:docPr id="13" name="11-github-repo.png" descr="11-github-repo.png" title="11-github-repo.png"/>
+            <wp:cNvGraphicFramePr>
+              <a:graphicFrameLocks xmlns:a="http://schemas.openxmlformats.org/drawingml/2006/main" noChangeAspect="1"/>
+            </wp:cNvGraphicFramePr>
+            <a:graphic xmlns:a="http://schemas.openxmlformats.org/drawingml/2006/main">
+              <a:graphicData uri="http://schemas.openxmlformats.org/drawingml/2006/picture">
+                <pic:pic xmlns:pic="http://schemas.openxmlformats.org/drawingml/2006/picture">
+                  <pic:nvPicPr>
+                    <pic:cNvPr id="0" name="" descr=""/>
+                    <pic:cNvPicPr>
+                      <a:picLocks noChangeAspect="1" noChangeArrowheads="1"/>
+                    </pic:cNvPicPr>
+                  </pic:nvPicPr>
+                  <pic:blipFill>
+                    <a:blip r:embed="rId22" cstate="none"/>
+                    <a:srcRect/>
+                    <a:stretch>
+                      <a:fillRect/>
+                    </a:stretch>
+                  </pic:blipFill>
+                  <pic:spPr bwMode="auto">
+                    <a:xfrm>
+                      <a:off x="0" y="0"/>
+                      <a:ext cx="6286500" cy="3619500"/>
+                    </a:xfrm>
+                    <a:prstGeom prst="rect">
+                      <a:avLst/>
+                    </a:prstGeom>
+                  </pic:spPr>
+                </pic:pic>
+              </a:graphicData>
+            </a:graphic>
+          </wp:inline>
+        </w:drawing>
+      </w:r>
+    </w:p>
+    <w:p>
+      <w:pPr>
+        <w:spacing w:after="200" w:before="40"/>
+        <w:jc w:val="center"/>
+      </w:pPr>
+      <w:r>
+        <w:rPr>
+          <w:rFonts w:ascii="Calibri" w:cs="Calibri" w:eastAsia="Calibri" w:hAnsi="Calibri"/>
+          <w:i/>
+          <w:iCs/>
+          <w:sz w:val="19"/>
+          <w:szCs w:val="19"/>
+        </w:rPr>
+        <w:t xml:space="preserve">Figure A12: GitHub repository NirbhaySharma504/calculator_devops</w:t>
       </w:r>
     </w:p>
     <w:sectPr>
@@ -2530,6 +3570,139 @@
     <w:basedOn w:val="Normal"/>
     <w:qFormat/>
   </w:style>
+  <w:style w:type="paragraph" w:styleId="Caption">
+    <w:name w:val="caption"/>
+    <w:basedOn w:val="Normal"/>
+    <w:next w:val="Normal"/>
+    <w:uiPriority w:val="35"/>
+    <w:semiHidden/>
+    <w:unhideWhenUsed/>
+    <w:qFormat/>
+    <w:pPr>
+      <w:spacing w:after="200"/>
+    </w:pPr>
+    <w:rPr>
+      <w:i/>
+      <w:iCs/>
+      <w:color w:val="44546A" w:themeColor="dark2"/>
+      <w:sz w:val="18"/>
+      <w:szCs w:val="18"/>
+    </w:rPr>
+  </w:style>
+  <w:style w:type="paragraph" w:styleId="Bibliography">
+    <w:name w:val="Bibliography"/>
+    <w:basedOn w:val="Normal"/>
+    <w:next w:val="Normal"/>
+    <w:uiPriority w:val="37"/>
+    <w:unhideWhenUsed/>
+  </w:style>
+  <w:style w:type="paragraph" w:styleId="TOC1">
+    <w:name w:val="toc 1"/>
+    <w:basedOn w:val="Normal"/>
+    <w:next w:val="Normal"/>
+    <w:uiPriority w:val="39"/>
+    <w:semiHidden/>
+    <w:unhideWhenUsed/>
+    <w:pPr>
+      <w:spacing w:after="100"/>
+    </w:pPr>
+  </w:style>
+  <w:style w:type="paragraph" w:styleId="TOC2">
+    <w:name w:val="toc 2"/>
+    <w:basedOn w:val="Normal"/>
+    <w:next w:val="Normal"/>
+    <w:uiPriority w:val="39"/>
+    <w:semiHidden/>
+    <w:unhideWhenUsed/>
+    <w:pPr>
+      <w:spacing w:after="100"/>
+      <w:ind w:left="210"/>
+    </w:pPr>
+  </w:style>
+  <w:style w:type="paragraph" w:styleId="TOC3">
+    <w:name w:val="toc 3"/>
+    <w:basedOn w:val="Normal"/>
+    <w:next w:val="Normal"/>
+    <w:uiPriority w:val="39"/>
+    <w:semiHidden/>
+    <w:unhideWhenUsed/>
+    <w:pPr>
+      <w:spacing w:after="100"/>
+      <w:ind w:left="420"/>
+    </w:pPr>
+  </w:style>
+  <w:style w:type="paragraph" w:styleId="TOC4">
+    <w:name w:val="toc 4"/>
+    <w:basedOn w:val="Normal"/>
+    <w:next w:val="Normal"/>
+    <w:uiPriority w:val="39"/>
+    <w:semiHidden/>
+    <w:unhideWhenUsed/>
+    <w:pPr>
+      <w:spacing w:after="100"/>
+      <w:ind w:left="630"/>
+    </w:pPr>
+  </w:style>
+  <w:style w:type="paragraph" w:styleId="TOC5">
+    <w:name w:val="toc 5"/>
+    <w:basedOn w:val="Normal"/>
+    <w:next w:val="Normal"/>
+    <w:uiPriority w:val="39"/>
+    <w:semiHidden/>
+    <w:unhideWhenUsed/>
+    <w:pPr>
+      <w:spacing w:after="100"/>
+      <w:ind w:left="840"/>
+    </w:pPr>
+  </w:style>
+  <w:style w:type="paragraph" w:styleId="TOC6">
+    <w:name w:val="toc 6"/>
+    <w:basedOn w:val="Normal"/>
+    <w:next w:val="Normal"/>
+    <w:uiPriority w:val="39"/>
+    <w:semiHidden/>
+    <w:unhideWhenUsed/>
+    <w:pPr>
+      <w:spacing w:after="100"/>
+      <w:ind w:left="1050"/>
+    </w:pPr>
+  </w:style>
+  <w:style w:type="paragraph" w:styleId="TOC7">
+    <w:name w:val="toc 7"/>
+    <w:basedOn w:val="Normal"/>
+    <w:next w:val="Normal"/>
+    <w:uiPriority w:val="39"/>
+    <w:semiHidden/>
+    <w:unhideWhenUsed/>
+    <w:pPr>
+      <w:spacing w:after="100"/>
+      <w:ind w:left="1260"/>
+    </w:pPr>
+  </w:style>
+  <w:style w:type="paragraph" w:styleId="TOC8">
+    <w:name w:val="toc 8"/>
+    <w:basedOn w:val="Normal"/>
+    <w:next w:val="Normal"/>
+    <w:uiPriority w:val="39"/>
+    <w:semiHidden/>
+    <w:unhideWhenUsed/>
+    <w:pPr>
+      <w:spacing w:after="100"/>
+      <w:ind w:left="1470"/>
+    </w:pPr>
+  </w:style>
+  <w:style w:type="paragraph" w:styleId="TOC9">
+    <w:name w:val="toc 9"/>
+    <w:basedOn w:val="Normal"/>
+    <w:next w:val="Normal"/>
+    <w:uiPriority w:val="39"/>
+    <w:semiHidden/>
+    <w:unhideWhenUsed/>
+    <w:pPr>
+      <w:spacing w:after="100"/>
+      <w:ind w:left="1680"/>
+    </w:pPr>
+  </w:style>
   <w:style w:type="character" w:styleId="Hyperlink">
     <w:name w:val="Hyperlink"/>
     <w:basedOn w:val="DefaultParagraphFont"/>
@@ -2614,12 +3787,20 @@
       <w:szCs w:val="20"/>
     </w:rPr>
   </w:style>
+  <w:style w:type="character" w:styleId="LineNumber">
+    <w:name w:val="line number"/>
+    <w:basedOn w:val="DefaultParagraphFont"/>
+    <w:uiPriority w:val="99"/>
+    <w:semiHidden/>
+    <w:unhideWhenUsed/>
+  </w:style>
   <w:style w:type="paragraph" w:styleId="Heading1">
     <w:name w:val="Heading 1"/>
     <w:basedOn w:val="Normal"/>
     <w:next w:val="Normal"/>
     <w:qFormat/>
     <w:pPr>
+      <w:keepNext/>
       <w:spacing w:after="80" w:before="160"/>
       <w:outlineLvl w:val="0"/>
     </w:pPr>

</xml_diff>

<commit_message>
Report: correct degree to Integrated M.Tech and detail email notification path
State that build emails go through Gmail SMTP (smtp.gmail.com:465, SSL)
to Nirbhay.Sharma@iiitb.ac.in.
</commit_message>
<xml_diff>
--- a/report/SPE_MiniProject_Report.docx
+++ b/report/SPE_MiniProject_Report.docx
@@ -72,7 +72,7 @@
           <w:sz w:val="21"/>
           <w:szCs w:val="21"/>
         </w:rPr>
-        <w:t xml:space="preserve">   ·   M.Tech (CSE), Term I 2026-27</w:t>
+        <w:t xml:space="preserve">   ·   Integrated M.Tech (iMTech), CSE, Term I 2026-27</w:t>
       </w:r>
     </w:p>
     <w:p>
@@ -88,7 +88,7 @@
         </w:rPr>
         <w:t xml:space="preserve">GitHub: </w:t>
       </w:r>
-      <w:hyperlink w:history="1" r:id="rIdvwk3wzttqpbeho64ptnsu">
+      <w:hyperlink w:history="1" r:id="rId_jhcb-geahbzer3vyc_fn">
         <w:r>
           <w:rPr>
             <w:rStyle w:val="Hyperlink"/>
@@ -116,7 +116,7 @@
         </w:rPr>
         <w:t xml:space="preserve">Docker Hub: </w:t>
       </w:r>
-      <w:hyperlink w:history="1" r:id="rId4-8neh24oukzztchsusk1">
+      <w:hyperlink w:history="1" r:id="rIdwgg-l7qs1krh8phffjqn0">
         <w:r>
           <w:rPr>
             <w:rStyle w:val="Hyperlink"/>
@@ -1122,7 +1122,7 @@
           <w:sz w:val="21"/>
           <w:szCs w:val="21"/>
         </w:rPr>
-        <w:t xml:space="preserve">emailext sends a SUCCESS or FAILURE email (the failure email attaches the log), then dangling images and old build tags are pruned locally.</w:t>
+        <w:t xml:space="preserve">emailext sends a SUCCESS or FAILURE email (the failure email attaches the log) through Gmail SMTP (smtp.gmail.com, port 465, SSL) from a personal Gmail account to Nirbhay.Sharma@iiitb.ac.in; then dangling images and old build tags are pruned locally.</w:t>
       </w:r>
     </w:p>
     <w:p>

</xml_diff>